<commit_message>
Week 5 task titles
</commit_message>
<xml_diff>
--- a/TO DO/A2 Tasks.docx
+++ b/TO DO/A2 Tasks.docx
@@ -48,6 +48,338 @@
     </w:p>
     <w:p/>
     <w:p/>
+    <w:sdt>
+      <w:sdtPr>
+        <w:id w:val="-981613725"/>
+        <w:docPartObj>
+          <w:docPartGallery w:val="Table of Contents"/>
+          <w:docPartUnique/>
+        </w:docPartObj>
+      </w:sdtPr>
+      <w:sdtEndPr>
+        <w:rPr>
+          <w:rFonts w:asciiTheme="minorHAnsi" w:eastAsiaTheme="minorHAnsi" w:hAnsiTheme="minorHAnsi" w:cstheme="minorBidi"/>
+          <w:b/>
+          <w:bCs/>
+          <w:noProof/>
+          <w:color w:val="auto"/>
+          <w:kern w:val="2"/>
+          <w:sz w:val="24"/>
+          <w:szCs w:val="24"/>
+          <w:lang w:val="en-AU"/>
+          <w14:ligatures w14:val="standardContextual"/>
+        </w:rPr>
+      </w:sdtEndPr>
+      <w:sdtContent>
+        <w:p>
+          <w:pPr>
+            <w:pStyle w:val="TOCHeading"/>
+          </w:pPr>
+          <w:r>
+            <w:t>Contents</w:t>
+          </w:r>
+        </w:p>
+        <w:p>
+          <w:pPr>
+            <w:pStyle w:val="TOC1"/>
+            <w:tabs>
+              <w:tab w:val="right" w:leader="dot" w:pos="9016"/>
+            </w:tabs>
+            <w:rPr>
+              <w:rFonts w:eastAsiaTheme="minorEastAsia"/>
+              <w:noProof/>
+              <w:lang w:eastAsia="en-AU"/>
+            </w:rPr>
+          </w:pPr>
+          <w:r>
+            <w:fldChar w:fldCharType="begin"/>
+          </w:r>
+          <w:r>
+            <w:instrText xml:space="preserve"> TOC \o "1-3" \h \z \u </w:instrText>
+          </w:r>
+          <w:r>
+            <w:fldChar w:fldCharType="separate"/>
+          </w:r>
+          <w:hyperlink w:anchor="_Toc237545049" w:history="1">
+            <w:r>
+              <w:rPr>
+                <w:rStyle w:val="Hyperlink"/>
+                <w:noProof/>
+              </w:rPr>
+              <w:t>Week 4</w:t>
+            </w:r>
+            <w:r>
+              <w:rPr>
+                <w:noProof/>
+                <w:webHidden/>
+              </w:rPr>
+              <w:tab/>
+            </w:r>
+            <w:r>
+              <w:rPr>
+                <w:noProof/>
+                <w:webHidden/>
+              </w:rPr>
+              <w:fldChar w:fldCharType="begin"/>
+            </w:r>
+            <w:r>
+              <w:rPr>
+                <w:noProof/>
+                <w:webHidden/>
+              </w:rPr>
+              <w:instrText xml:space="preserve"> PAGEREF _Toc237545049 \h </w:instrText>
+            </w:r>
+            <w:r>
+              <w:rPr>
+                <w:noProof/>
+                <w:webHidden/>
+              </w:rPr>
+            </w:r>
+            <w:r>
+              <w:rPr>
+                <w:noProof/>
+                <w:webHidden/>
+              </w:rPr>
+              <w:fldChar w:fldCharType="separate"/>
+            </w:r>
+            <w:r>
+              <w:rPr>
+                <w:noProof/>
+                <w:webHidden/>
+              </w:rPr>
+              <w:t>2</w:t>
+            </w:r>
+            <w:r>
+              <w:rPr>
+                <w:noProof/>
+                <w:webHidden/>
+              </w:rPr>
+              <w:fldChar w:fldCharType="end"/>
+            </w:r>
+          </w:hyperlink>
+        </w:p>
+        <w:p>
+          <w:pPr>
+            <w:pStyle w:val="TOC2"/>
+            <w:tabs>
+              <w:tab w:val="right" w:leader="dot" w:pos="9016"/>
+            </w:tabs>
+            <w:rPr>
+              <w:rFonts w:eastAsiaTheme="minorEastAsia"/>
+              <w:noProof/>
+              <w:lang w:eastAsia="en-AU"/>
+            </w:rPr>
+          </w:pPr>
+          <w:hyperlink w:anchor="_Toc237545050" w:history="1">
+            <w:r>
+              <w:rPr>
+                <w:rStyle w:val="Hyperlink"/>
+                <w:noProof/>
+              </w:rPr>
+              <w:t>Matthew – Android UI &amp; User Profile</w:t>
+            </w:r>
+            <w:r>
+              <w:rPr>
+                <w:noProof/>
+                <w:webHidden/>
+              </w:rPr>
+              <w:tab/>
+            </w:r>
+            <w:r>
+              <w:rPr>
+                <w:noProof/>
+                <w:webHidden/>
+              </w:rPr>
+              <w:fldChar w:fldCharType="begin"/>
+            </w:r>
+            <w:r>
+              <w:rPr>
+                <w:noProof/>
+                <w:webHidden/>
+              </w:rPr>
+              <w:instrText xml:space="preserve"> PAGEREF _Toc237545050 \h </w:instrText>
+            </w:r>
+            <w:r>
+              <w:rPr>
+                <w:noProof/>
+                <w:webHidden/>
+              </w:rPr>
+            </w:r>
+            <w:r>
+              <w:rPr>
+                <w:noProof/>
+                <w:webHidden/>
+              </w:rPr>
+              <w:fldChar w:fldCharType="separate"/>
+            </w:r>
+            <w:r>
+              <w:rPr>
+                <w:noProof/>
+                <w:webHidden/>
+              </w:rPr>
+              <w:t>2</w:t>
+            </w:r>
+            <w:r>
+              <w:rPr>
+                <w:noProof/>
+                <w:webHidden/>
+              </w:rPr>
+              <w:fldChar w:fldCharType="end"/>
+            </w:r>
+          </w:hyperlink>
+        </w:p>
+        <w:p>
+          <w:pPr>
+            <w:pStyle w:val="TOC2"/>
+            <w:tabs>
+              <w:tab w:val="right" w:leader="dot" w:pos="9016"/>
+            </w:tabs>
+            <w:rPr>
+              <w:rFonts w:eastAsiaTheme="minorEastAsia"/>
+              <w:noProof/>
+              <w:lang w:eastAsia="en-AU"/>
+            </w:rPr>
+          </w:pPr>
+          <w:hyperlink w:anchor="_Toc237545051" w:history="1">
+            <w:r>
+              <w:rPr>
+                <w:rStyle w:val="Hyperlink"/>
+                <w:noProof/>
+              </w:rPr>
+              <w:t>Farhad – AI Meal Plan &amp; Recipe Generation</w:t>
+            </w:r>
+            <w:r>
+              <w:rPr>
+                <w:noProof/>
+                <w:webHidden/>
+              </w:rPr>
+              <w:tab/>
+            </w:r>
+            <w:r>
+              <w:rPr>
+                <w:noProof/>
+                <w:webHidden/>
+              </w:rPr>
+              <w:fldChar w:fldCharType="begin"/>
+            </w:r>
+            <w:r>
+              <w:rPr>
+                <w:noProof/>
+                <w:webHidden/>
+              </w:rPr>
+              <w:instrText xml:space="preserve"> PAGEREF _Toc237545051 \h </w:instrText>
+            </w:r>
+            <w:r>
+              <w:rPr>
+                <w:noProof/>
+                <w:webHidden/>
+              </w:rPr>
+            </w:r>
+            <w:r>
+              <w:rPr>
+                <w:noProof/>
+                <w:webHidden/>
+              </w:rPr>
+              <w:fldChar w:fldCharType="separate"/>
+            </w:r>
+            <w:r>
+              <w:rPr>
+                <w:noProof/>
+                <w:webHidden/>
+              </w:rPr>
+              <w:t>3</w:t>
+            </w:r>
+            <w:r>
+              <w:rPr>
+                <w:noProof/>
+                <w:webHidden/>
+              </w:rPr>
+              <w:fldChar w:fldCharType="end"/>
+            </w:r>
+          </w:hyperlink>
+        </w:p>
+        <w:p>
+          <w:pPr>
+            <w:pStyle w:val="TOC2"/>
+            <w:tabs>
+              <w:tab w:val="right" w:leader="dot" w:pos="9016"/>
+            </w:tabs>
+            <w:rPr>
+              <w:rFonts w:eastAsiaTheme="minorEastAsia"/>
+              <w:noProof/>
+              <w:lang w:eastAsia="en-AU"/>
+            </w:rPr>
+          </w:pPr>
+          <w:hyperlink w:anchor="_Toc237545052" w:history="1">
+            <w:r>
+              <w:rPr>
+                <w:rStyle w:val="Hyperlink"/>
+                <w:noProof/>
+              </w:rPr>
+              <w:t>Ansh – Nutrition, Grocery List &amp; Data Storage</w:t>
+            </w:r>
+            <w:r>
+              <w:rPr>
+                <w:noProof/>
+                <w:webHidden/>
+              </w:rPr>
+              <w:tab/>
+            </w:r>
+            <w:r>
+              <w:rPr>
+                <w:noProof/>
+                <w:webHidden/>
+              </w:rPr>
+              <w:fldChar w:fldCharType="begin"/>
+            </w:r>
+            <w:r>
+              <w:rPr>
+                <w:noProof/>
+                <w:webHidden/>
+              </w:rPr>
+              <w:instrText xml:space="preserve"> PAGEREF _Toc237545052 \h </w:instrText>
+            </w:r>
+            <w:r>
+              <w:rPr>
+                <w:noProof/>
+                <w:webHidden/>
+              </w:rPr>
+            </w:r>
+            <w:r>
+              <w:rPr>
+                <w:noProof/>
+                <w:webHidden/>
+              </w:rPr>
+              <w:fldChar w:fldCharType="separate"/>
+            </w:r>
+            <w:r>
+              <w:rPr>
+                <w:noProof/>
+                <w:webHidden/>
+              </w:rPr>
+              <w:t>4</w:t>
+            </w:r>
+            <w:r>
+              <w:rPr>
+                <w:noProof/>
+                <w:webHidden/>
+              </w:rPr>
+              <w:fldChar w:fldCharType="end"/>
+            </w:r>
+          </w:hyperlink>
+        </w:p>
+        <w:p>
+          <w:r>
+            <w:rPr>
+              <w:b/>
+              <w:bCs/>
+              <w:noProof/>
+            </w:rPr>
+            <w:fldChar w:fldCharType="end"/>
+          </w:r>
+        </w:p>
+      </w:sdtContent>
+    </w:sdt>
     <w:p>
       <w:pPr>
         <w:rPr>
@@ -65,10 +397,22 @@
       <w:pPr>
         <w:pStyle w:val="Heading1"/>
       </w:pPr>
+      <w:bookmarkStart w:id="0" w:name="_Toc237545049"/>
       <w:r>
         <w:lastRenderedPageBreak/>
+        <w:t>Week 4</w:t>
+      </w:r>
+      <w:bookmarkEnd w:id="0"/>
+    </w:p>
+    <w:p>
+      <w:pPr>
+        <w:pStyle w:val="Heading2"/>
+      </w:pPr>
+      <w:bookmarkStart w:id="1" w:name="_Toc237545050"/>
+      <w:r>
         <w:t>Matthew – Android UI &amp; User Profile</w:t>
       </w:r>
+      <w:bookmarkEnd w:id="1"/>
     </w:p>
     <w:p>
       <w:r>
@@ -216,12 +560,14 @@
     </w:p>
     <w:p>
       <w:pPr>
-        <w:pStyle w:val="Heading1"/>
-      </w:pPr>
+        <w:pStyle w:val="Heading2"/>
+      </w:pPr>
+      <w:bookmarkStart w:id="2" w:name="_Toc237545051"/>
       <w:r>
         <w:lastRenderedPageBreak/>
         <w:t>Farhad – AI Meal Plan &amp; Recipe Generation</w:t>
       </w:r>
+      <w:bookmarkEnd w:id="2"/>
     </w:p>
     <w:p>
       <w:r>
@@ -358,12 +704,14 @@
     </w:p>
     <w:p>
       <w:pPr>
-        <w:pStyle w:val="Heading1"/>
-      </w:pPr>
+        <w:pStyle w:val="Heading2"/>
+      </w:pPr>
+      <w:bookmarkStart w:id="3" w:name="_Toc237545052"/>
       <w:r>
         <w:lastRenderedPageBreak/>
         <w:t>Ansh – Nutrition, Grocery List &amp; Data Storage</w:t>
       </w:r>
+      <w:bookmarkEnd w:id="3"/>
     </w:p>
     <w:p>
       <w:r>
@@ -482,6 +830,155 @@
         <w:t>.</w:t>
       </w:r>
     </w:p>
+    <w:p>
+      <w:r>
+        <w:br w:type="page"/>
+      </w:r>
+    </w:p>
+    <w:p>
+      <w:pPr>
+        <w:pStyle w:val="Heading1"/>
+      </w:pPr>
+      <w:r>
+        <w:lastRenderedPageBreak/>
+        <w:t>Week 5</w:t>
+      </w:r>
+    </w:p>
+    <w:p>
+      <w:pPr>
+        <w:pStyle w:val="Heading2"/>
+      </w:pPr>
+      <w:r>
+        <w:t>Matthew – User Profile &amp; Mobile Interface</w:t>
+      </w:r>
+    </w:p>
+    <w:p>
+      <w:pPr>
+        <w:pStyle w:val="ListParagraph"/>
+        <w:numPr>
+          <w:ilvl w:val="0"/>
+          <w:numId w:val="19"/>
+        </w:numPr>
+      </w:pPr>
+      <w:r>
+        <w:t xml:space="preserve">Activities 1–2: Identify classes for User Profile/Mobile Interface and develop the related UML class diagram. </w:t>
+      </w:r>
+    </w:p>
+    <w:p>
+      <w:pPr>
+        <w:pStyle w:val="ListParagraph"/>
+        <w:numPr>
+          <w:ilvl w:val="0"/>
+          <w:numId w:val="19"/>
+        </w:numPr>
+      </w:pPr>
+      <w:r>
+        <w:t xml:space="preserve">Activities 3–4: Lead user data entry/UI component identification and initial UI design. </w:t>
+      </w:r>
+    </w:p>
+    <w:p>
+      <w:pPr>
+        <w:pStyle w:val="ListParagraph"/>
+        <w:numPr>
+          <w:ilvl w:val="0"/>
+          <w:numId w:val="19"/>
+        </w:numPr>
+      </w:pPr>
+      <w:r>
+        <w:t xml:space="preserve">Contribute any User Profile data that needs to be considered for the database in Activity 5. </w:t>
+      </w:r>
+    </w:p>
+    <w:p/>
+    <w:p>
+      <w:pPr>
+        <w:pStyle w:val="Heading2"/>
+      </w:pPr>
+      <w:r>
+        <w:t>Farhad – Meal Plan &amp; Recipe Generation</w:t>
+      </w:r>
+    </w:p>
+    <w:p>
+      <w:pPr>
+        <w:pStyle w:val="ListParagraph"/>
+        <w:numPr>
+          <w:ilvl w:val="0"/>
+          <w:numId w:val="20"/>
+        </w:numPr>
+      </w:pPr>
+      <w:r>
+        <w:t xml:space="preserve">Activities 1–2: Identify classes for Meal Plan/Recipe Generation and develop the related UML class diagram. </w:t>
+      </w:r>
+    </w:p>
+    <w:p>
+      <w:pPr>
+        <w:pStyle w:val="ListParagraph"/>
+        <w:numPr>
+          <w:ilvl w:val="0"/>
+          <w:numId w:val="20"/>
+        </w:numPr>
+      </w:pPr>
+      <w:r>
+        <w:t xml:space="preserve">Activity 6: Lead client-server communication design for the Generative AI API. </w:t>
+      </w:r>
+    </w:p>
+    <w:p>
+      <w:pPr>
+        <w:pStyle w:val="ListParagraph"/>
+        <w:numPr>
+          <w:ilvl w:val="0"/>
+          <w:numId w:val="20"/>
+        </w:numPr>
+      </w:pPr>
+      <w:r>
+        <w:t xml:space="preserve">Contribute Meal Plan/Recipe entities or data that need storage for Activity 5. </w:t>
+      </w:r>
+    </w:p>
+    <w:p/>
+    <w:p>
+      <w:pPr>
+        <w:pStyle w:val="Heading2"/>
+      </w:pPr>
+      <w:r>
+        <w:t>Ansh – Nutrition, Grocery List &amp; Data Storage</w:t>
+      </w:r>
+    </w:p>
+    <w:p>
+      <w:pPr>
+        <w:pStyle w:val="ListParagraph"/>
+        <w:numPr>
+          <w:ilvl w:val="0"/>
+          <w:numId w:val="21"/>
+        </w:numPr>
+      </w:pPr>
+      <w:r>
+        <w:t xml:space="preserve">Activities 1–2: Identify classes for Nutrition Analysis/Grocery List/Data Storage and develop the related UML class diagram. </w:t>
+      </w:r>
+    </w:p>
+    <w:p>
+      <w:pPr>
+        <w:pStyle w:val="ListParagraph"/>
+        <w:numPr>
+          <w:ilvl w:val="0"/>
+          <w:numId w:val="21"/>
+        </w:numPr>
+      </w:pPr>
+      <w:r>
+        <w:t xml:space="preserve">Activity 5: Lead database design and develop the ERD. </w:t>
+      </w:r>
+    </w:p>
+    <w:p>
+      <w:pPr>
+        <w:pStyle w:val="ListParagraph"/>
+        <w:numPr>
+          <w:ilvl w:val="0"/>
+          <w:numId w:val="21"/>
+        </w:numPr>
+      </w:pPr>
+      <w:r>
+        <w:t>Consider how the AFCD nutrition data will be represented/accessed within the data design.</w:t>
+      </w:r>
+    </w:p>
+    <w:p/>
     <w:sectPr>
       <w:pgSz w:w="11906" w:h="16838"/>
       <w:pgMar w:top="1440" w:right="1440" w:bottom="1440" w:left="1440" w:header="708" w:footer="708" w:gutter="0"/>
@@ -495,6 +992,155 @@
 <file path=word/numbering.xml><?xml version="1.0" encoding="utf-8"?>
 <w:numbering xmlns:wpc="http://schemas.microsoft.com/office/word/2010/wordprocessingCanvas" xmlns:cx="http://schemas.microsoft.com/office/drawing/2014/chartex" xmlns:cx1="http://schemas.microsoft.com/office/drawing/2015/9/8/chartex" xmlns:cx2="http://schemas.microsoft.com/office/drawing/2015/10/21/chartex" xmlns:cx3="http://schemas.microsoft.com/office/drawing/2016/5/9/chartex" xmlns:cx4="http://schemas.microsoft.com/office/drawing/2016/5/10/chartex" xmlns:cx5="http://schemas.microsoft.com/office/drawing/2016/5/11/chartex" xmlns:cx6="http://schemas.microsoft.com/office/drawing/2016/5/12/chartex" xmlns:cx7="http://schemas.microsoft.com/office/drawing/2016/5/13/chartex" xmlns:cx8="http://schemas.microsoft.com/office/drawing/2016/5/14/chartex" xmlns:mc="http://schemas.openxmlformats.org/markup-compatibility/2006" xmlns:aink="http://schemas.microsoft.com/office/drawing/2016/ink" xmlns:am3d="http://schemas.microsoft.com/office/drawing/2017/model3d" xmlns:o="urn:schemas-microsoft-com:office:office" xmlns:oel="http://schemas.microsoft.com/office/2019/extlst" xmlns:r="http://schemas.openxmlformats.org/officeDocument/2006/relationships" xmlns:m="http://schemas.openxmlformats.org/officeDocument/2006/math" xmlns:v="urn:schemas-microsoft-com:vml" xmlns:wp14="http://schemas.microsoft.com/office/word/2010/wordprocessingDrawing" xmlns:wp="http://schemas.openxmlformats.org/drawingml/2006/wordprocessingDrawing" xmlns:w10="urn:schemas-microsoft-com:office:word" xmlns:w="http://schemas.openxmlformats.org/wordprocessingml/2006/main" xmlns:w14="http://schemas.microsoft.com/office/word/2010/wordml" xmlns:w15="http://schemas.microsoft.com/office/word/2012/wordml" xmlns:w16cei="http://schemas.microsoft.com/office/word/2026/wordml/cei" xmlns:w16cex="http://schemas.microsoft.com/office/word/2018/wordml/cex" xmlns:w16cid="http://schemas.microsoft.com/office/word/2016/wordml/cid" xmlns:w16="http://schemas.microsoft.com/office/word/2018/wordml" xmlns:w16du="http://schemas.microsoft.com/office/word/2023/wordml/word16du" xmlns:w16sdtdh="http://schemas.microsoft.com/office/word/2020/wordml/sdtdatahash" xmlns:w16sdtfl="http://schemas.microsoft.com/office/word/2024/wordml/sdtformatlock" xmlns:w16se="http://schemas.microsoft.com/office/word/2015/wordml/symex" xmlns:wpg="http://schemas.microsoft.com/office/word/2010/wordprocessingGroup" xmlns:wpi="http://schemas.microsoft.com/office/word/2010/wordprocessingInk" xmlns:wne="http://schemas.microsoft.com/office/word/2006/wordml" xmlns:wps="http://schemas.microsoft.com/office/word/2010/wordprocessingShape" mc:Ignorable="w14 w15 w16se w16cid w16 w16cex w16sdtdh w16sdtfl w16du wp14">
   <w:abstractNum w:abstractNumId="0" w15:restartNumberingAfterBreak="0">
+    <w:nsid w:val="00FC6A89"/>
+    <w:multiLevelType w:val="multilevel"/>
+    <w:tmpl w:val="A4BE803E"/>
+    <w:lvl w:ilvl="0">
+      <w:start w:val="1"/>
+      <w:numFmt w:val="bullet"/>
+      <w:lvlText w:val=""/>
+      <w:lvlJc w:val="left"/>
+      <w:pPr>
+        <w:tabs>
+          <w:tab w:val="num" w:pos="720"/>
+        </w:tabs>
+        <w:ind w:left="720" w:hanging="360"/>
+      </w:pPr>
+      <w:rPr>
+        <w:rFonts w:ascii="Symbol" w:hAnsi="Symbol" w:hint="default"/>
+        <w:sz w:val="20"/>
+      </w:rPr>
+    </w:lvl>
+    <w:lvl w:ilvl="1" w:tentative="1">
+      <w:start w:val="1"/>
+      <w:numFmt w:val="bullet"/>
+      <w:lvlText w:val="o"/>
+      <w:lvlJc w:val="left"/>
+      <w:pPr>
+        <w:tabs>
+          <w:tab w:val="num" w:pos="1440"/>
+        </w:tabs>
+        <w:ind w:left="1440" w:hanging="360"/>
+      </w:pPr>
+      <w:rPr>
+        <w:rFonts w:ascii="Courier New" w:hAnsi="Courier New" w:hint="default"/>
+        <w:sz w:val="20"/>
+      </w:rPr>
+    </w:lvl>
+    <w:lvl w:ilvl="2" w:tentative="1">
+      <w:start w:val="1"/>
+      <w:numFmt w:val="bullet"/>
+      <w:lvlText w:val=""/>
+      <w:lvlJc w:val="left"/>
+      <w:pPr>
+        <w:tabs>
+          <w:tab w:val="num" w:pos="2160"/>
+        </w:tabs>
+        <w:ind w:left="2160" w:hanging="360"/>
+      </w:pPr>
+      <w:rPr>
+        <w:rFonts w:ascii="Wingdings" w:hAnsi="Wingdings" w:hint="default"/>
+        <w:sz w:val="20"/>
+      </w:rPr>
+    </w:lvl>
+    <w:lvl w:ilvl="3" w:tentative="1">
+      <w:start w:val="1"/>
+      <w:numFmt w:val="bullet"/>
+      <w:lvlText w:val=""/>
+      <w:lvlJc w:val="left"/>
+      <w:pPr>
+        <w:tabs>
+          <w:tab w:val="num" w:pos="2880"/>
+        </w:tabs>
+        <w:ind w:left="2880" w:hanging="360"/>
+      </w:pPr>
+      <w:rPr>
+        <w:rFonts w:ascii="Wingdings" w:hAnsi="Wingdings" w:hint="default"/>
+        <w:sz w:val="20"/>
+      </w:rPr>
+    </w:lvl>
+    <w:lvl w:ilvl="4" w:tentative="1">
+      <w:start w:val="1"/>
+      <w:numFmt w:val="bullet"/>
+      <w:lvlText w:val=""/>
+      <w:lvlJc w:val="left"/>
+      <w:pPr>
+        <w:tabs>
+          <w:tab w:val="num" w:pos="3600"/>
+        </w:tabs>
+        <w:ind w:left="3600" w:hanging="360"/>
+      </w:pPr>
+      <w:rPr>
+        <w:rFonts w:ascii="Wingdings" w:hAnsi="Wingdings" w:hint="default"/>
+        <w:sz w:val="20"/>
+      </w:rPr>
+    </w:lvl>
+    <w:lvl w:ilvl="5" w:tentative="1">
+      <w:start w:val="1"/>
+      <w:numFmt w:val="bullet"/>
+      <w:lvlText w:val=""/>
+      <w:lvlJc w:val="left"/>
+      <w:pPr>
+        <w:tabs>
+          <w:tab w:val="num" w:pos="4320"/>
+        </w:tabs>
+        <w:ind w:left="4320" w:hanging="360"/>
+      </w:pPr>
+      <w:rPr>
+        <w:rFonts w:ascii="Wingdings" w:hAnsi="Wingdings" w:hint="default"/>
+        <w:sz w:val="20"/>
+      </w:rPr>
+    </w:lvl>
+    <w:lvl w:ilvl="6" w:tentative="1">
+      <w:start w:val="1"/>
+      <w:numFmt w:val="bullet"/>
+      <w:lvlText w:val=""/>
+      <w:lvlJc w:val="left"/>
+      <w:pPr>
+        <w:tabs>
+          <w:tab w:val="num" w:pos="5040"/>
+        </w:tabs>
+        <w:ind w:left="5040" w:hanging="360"/>
+      </w:pPr>
+      <w:rPr>
+        <w:rFonts w:ascii="Wingdings" w:hAnsi="Wingdings" w:hint="default"/>
+        <w:sz w:val="20"/>
+      </w:rPr>
+    </w:lvl>
+    <w:lvl w:ilvl="7" w:tentative="1">
+      <w:start w:val="1"/>
+      <w:numFmt w:val="bullet"/>
+      <w:lvlText w:val=""/>
+      <w:lvlJc w:val="left"/>
+      <w:pPr>
+        <w:tabs>
+          <w:tab w:val="num" w:pos="5760"/>
+        </w:tabs>
+        <w:ind w:left="5760" w:hanging="360"/>
+      </w:pPr>
+      <w:rPr>
+        <w:rFonts w:ascii="Wingdings" w:hAnsi="Wingdings" w:hint="default"/>
+        <w:sz w:val="20"/>
+      </w:rPr>
+    </w:lvl>
+    <w:lvl w:ilvl="8" w:tentative="1">
+      <w:start w:val="1"/>
+      <w:numFmt w:val="bullet"/>
+      <w:lvlText w:val=""/>
+      <w:lvlJc w:val="left"/>
+      <w:pPr>
+        <w:tabs>
+          <w:tab w:val="num" w:pos="6480"/>
+        </w:tabs>
+        <w:ind w:left="6480" w:hanging="360"/>
+      </w:pPr>
+      <w:rPr>
+        <w:rFonts w:ascii="Wingdings" w:hAnsi="Wingdings" w:hint="default"/>
+        <w:sz w:val="20"/>
+      </w:rPr>
+    </w:lvl>
+  </w:abstractNum>
+  <w:abstractNum w:abstractNumId="1" w15:restartNumberingAfterBreak="0">
     <w:nsid w:val="18F53185"/>
     <w:multiLevelType w:val="multilevel"/>
     <w:tmpl w:val="FB603A22"/>
@@ -643,7 +1289,120 @@
       </w:rPr>
     </w:lvl>
   </w:abstractNum>
-  <w:abstractNum w:abstractNumId="1" w15:restartNumberingAfterBreak="0">
+  <w:abstractNum w:abstractNumId="2" w15:restartNumberingAfterBreak="0">
+    <w:nsid w:val="1A776EA4"/>
+    <w:multiLevelType w:val="hybridMultilevel"/>
+    <w:tmpl w:val="9C58641E"/>
+    <w:lvl w:ilvl="0" w:tplc="0C090001">
+      <w:start w:val="1"/>
+      <w:numFmt w:val="bullet"/>
+      <w:lvlText w:val=""/>
+      <w:lvlJc w:val="left"/>
+      <w:pPr>
+        <w:ind w:left="720" w:hanging="360"/>
+      </w:pPr>
+      <w:rPr>
+        <w:rFonts w:ascii="Symbol" w:hAnsi="Symbol" w:hint="default"/>
+      </w:rPr>
+    </w:lvl>
+    <w:lvl w:ilvl="1" w:tplc="0C090003" w:tentative="1">
+      <w:start w:val="1"/>
+      <w:numFmt w:val="bullet"/>
+      <w:lvlText w:val="o"/>
+      <w:lvlJc w:val="left"/>
+      <w:pPr>
+        <w:ind w:left="1440" w:hanging="360"/>
+      </w:pPr>
+      <w:rPr>
+        <w:rFonts w:ascii="Courier New" w:hAnsi="Courier New" w:cs="Courier New" w:hint="default"/>
+      </w:rPr>
+    </w:lvl>
+    <w:lvl w:ilvl="2" w:tplc="0C090005" w:tentative="1">
+      <w:start w:val="1"/>
+      <w:numFmt w:val="bullet"/>
+      <w:lvlText w:val=""/>
+      <w:lvlJc w:val="left"/>
+      <w:pPr>
+        <w:ind w:left="2160" w:hanging="360"/>
+      </w:pPr>
+      <w:rPr>
+        <w:rFonts w:ascii="Wingdings" w:hAnsi="Wingdings" w:hint="default"/>
+      </w:rPr>
+    </w:lvl>
+    <w:lvl w:ilvl="3" w:tplc="0C090001" w:tentative="1">
+      <w:start w:val="1"/>
+      <w:numFmt w:val="bullet"/>
+      <w:lvlText w:val=""/>
+      <w:lvlJc w:val="left"/>
+      <w:pPr>
+        <w:ind w:left="2880" w:hanging="360"/>
+      </w:pPr>
+      <w:rPr>
+        <w:rFonts w:ascii="Symbol" w:hAnsi="Symbol" w:hint="default"/>
+      </w:rPr>
+    </w:lvl>
+    <w:lvl w:ilvl="4" w:tplc="0C090003" w:tentative="1">
+      <w:start w:val="1"/>
+      <w:numFmt w:val="bullet"/>
+      <w:lvlText w:val="o"/>
+      <w:lvlJc w:val="left"/>
+      <w:pPr>
+        <w:ind w:left="3600" w:hanging="360"/>
+      </w:pPr>
+      <w:rPr>
+        <w:rFonts w:ascii="Courier New" w:hAnsi="Courier New" w:cs="Courier New" w:hint="default"/>
+      </w:rPr>
+    </w:lvl>
+    <w:lvl w:ilvl="5" w:tplc="0C090005" w:tentative="1">
+      <w:start w:val="1"/>
+      <w:numFmt w:val="bullet"/>
+      <w:lvlText w:val=""/>
+      <w:lvlJc w:val="left"/>
+      <w:pPr>
+        <w:ind w:left="4320" w:hanging="360"/>
+      </w:pPr>
+      <w:rPr>
+        <w:rFonts w:ascii="Wingdings" w:hAnsi="Wingdings" w:hint="default"/>
+      </w:rPr>
+    </w:lvl>
+    <w:lvl w:ilvl="6" w:tplc="0C090001" w:tentative="1">
+      <w:start w:val="1"/>
+      <w:numFmt w:val="bullet"/>
+      <w:lvlText w:val=""/>
+      <w:lvlJc w:val="left"/>
+      <w:pPr>
+        <w:ind w:left="5040" w:hanging="360"/>
+      </w:pPr>
+      <w:rPr>
+        <w:rFonts w:ascii="Symbol" w:hAnsi="Symbol" w:hint="default"/>
+      </w:rPr>
+    </w:lvl>
+    <w:lvl w:ilvl="7" w:tplc="0C090003" w:tentative="1">
+      <w:start w:val="1"/>
+      <w:numFmt w:val="bullet"/>
+      <w:lvlText w:val="o"/>
+      <w:lvlJc w:val="left"/>
+      <w:pPr>
+        <w:ind w:left="5760" w:hanging="360"/>
+      </w:pPr>
+      <w:rPr>
+        <w:rFonts w:ascii="Courier New" w:hAnsi="Courier New" w:cs="Courier New" w:hint="default"/>
+      </w:rPr>
+    </w:lvl>
+    <w:lvl w:ilvl="8" w:tplc="0C090005" w:tentative="1">
+      <w:start w:val="1"/>
+      <w:numFmt w:val="bullet"/>
+      <w:lvlText w:val=""/>
+      <w:lvlJc w:val="left"/>
+      <w:pPr>
+        <w:ind w:left="6480" w:hanging="360"/>
+      </w:pPr>
+      <w:rPr>
+        <w:rFonts w:ascii="Wingdings" w:hAnsi="Wingdings" w:hint="default"/>
+      </w:rPr>
+    </w:lvl>
+  </w:abstractNum>
+  <w:abstractNum w:abstractNumId="3" w15:restartNumberingAfterBreak="0">
     <w:nsid w:val="1FA42144"/>
     <w:multiLevelType w:val="multilevel"/>
     <w:tmpl w:val="BFD60F2C"/>
@@ -792,7 +1551,269 @@
       </w:rPr>
     </w:lvl>
   </w:abstractNum>
-  <w:abstractNum w:abstractNumId="2" w15:restartNumberingAfterBreak="0">
+  <w:abstractNum w:abstractNumId="4" w15:restartNumberingAfterBreak="0">
+    <w:nsid w:val="3A161039"/>
+    <w:multiLevelType w:val="multilevel"/>
+    <w:tmpl w:val="19C62966"/>
+    <w:lvl w:ilvl="0">
+      <w:start w:val="1"/>
+      <w:numFmt w:val="bullet"/>
+      <w:lvlText w:val=""/>
+      <w:lvlJc w:val="left"/>
+      <w:pPr>
+        <w:tabs>
+          <w:tab w:val="num" w:pos="720"/>
+        </w:tabs>
+        <w:ind w:left="720" w:hanging="360"/>
+      </w:pPr>
+      <w:rPr>
+        <w:rFonts w:ascii="Symbol" w:hAnsi="Symbol" w:hint="default"/>
+        <w:sz w:val="20"/>
+      </w:rPr>
+    </w:lvl>
+    <w:lvl w:ilvl="1" w:tentative="1">
+      <w:start w:val="1"/>
+      <w:numFmt w:val="bullet"/>
+      <w:lvlText w:val="o"/>
+      <w:lvlJc w:val="left"/>
+      <w:pPr>
+        <w:tabs>
+          <w:tab w:val="num" w:pos="1440"/>
+        </w:tabs>
+        <w:ind w:left="1440" w:hanging="360"/>
+      </w:pPr>
+      <w:rPr>
+        <w:rFonts w:ascii="Courier New" w:hAnsi="Courier New" w:hint="default"/>
+        <w:sz w:val="20"/>
+      </w:rPr>
+    </w:lvl>
+    <w:lvl w:ilvl="2" w:tentative="1">
+      <w:start w:val="1"/>
+      <w:numFmt w:val="bullet"/>
+      <w:lvlText w:val=""/>
+      <w:lvlJc w:val="left"/>
+      <w:pPr>
+        <w:tabs>
+          <w:tab w:val="num" w:pos="2160"/>
+        </w:tabs>
+        <w:ind w:left="2160" w:hanging="360"/>
+      </w:pPr>
+      <w:rPr>
+        <w:rFonts w:ascii="Wingdings" w:hAnsi="Wingdings" w:hint="default"/>
+        <w:sz w:val="20"/>
+      </w:rPr>
+    </w:lvl>
+    <w:lvl w:ilvl="3" w:tentative="1">
+      <w:start w:val="1"/>
+      <w:numFmt w:val="bullet"/>
+      <w:lvlText w:val=""/>
+      <w:lvlJc w:val="left"/>
+      <w:pPr>
+        <w:tabs>
+          <w:tab w:val="num" w:pos="2880"/>
+        </w:tabs>
+        <w:ind w:left="2880" w:hanging="360"/>
+      </w:pPr>
+      <w:rPr>
+        <w:rFonts w:ascii="Wingdings" w:hAnsi="Wingdings" w:hint="default"/>
+        <w:sz w:val="20"/>
+      </w:rPr>
+    </w:lvl>
+    <w:lvl w:ilvl="4" w:tentative="1">
+      <w:start w:val="1"/>
+      <w:numFmt w:val="bullet"/>
+      <w:lvlText w:val=""/>
+      <w:lvlJc w:val="left"/>
+      <w:pPr>
+        <w:tabs>
+          <w:tab w:val="num" w:pos="3600"/>
+        </w:tabs>
+        <w:ind w:left="3600" w:hanging="360"/>
+      </w:pPr>
+      <w:rPr>
+        <w:rFonts w:ascii="Wingdings" w:hAnsi="Wingdings" w:hint="default"/>
+        <w:sz w:val="20"/>
+      </w:rPr>
+    </w:lvl>
+    <w:lvl w:ilvl="5" w:tentative="1">
+      <w:start w:val="1"/>
+      <w:numFmt w:val="bullet"/>
+      <w:lvlText w:val=""/>
+      <w:lvlJc w:val="left"/>
+      <w:pPr>
+        <w:tabs>
+          <w:tab w:val="num" w:pos="4320"/>
+        </w:tabs>
+        <w:ind w:left="4320" w:hanging="360"/>
+      </w:pPr>
+      <w:rPr>
+        <w:rFonts w:ascii="Wingdings" w:hAnsi="Wingdings" w:hint="default"/>
+        <w:sz w:val="20"/>
+      </w:rPr>
+    </w:lvl>
+    <w:lvl w:ilvl="6" w:tentative="1">
+      <w:start w:val="1"/>
+      <w:numFmt w:val="bullet"/>
+      <w:lvlText w:val=""/>
+      <w:lvlJc w:val="left"/>
+      <w:pPr>
+        <w:tabs>
+          <w:tab w:val="num" w:pos="5040"/>
+        </w:tabs>
+        <w:ind w:left="5040" w:hanging="360"/>
+      </w:pPr>
+      <w:rPr>
+        <w:rFonts w:ascii="Wingdings" w:hAnsi="Wingdings" w:hint="default"/>
+        <w:sz w:val="20"/>
+      </w:rPr>
+    </w:lvl>
+    <w:lvl w:ilvl="7" w:tentative="1">
+      <w:start w:val="1"/>
+      <w:numFmt w:val="bullet"/>
+      <w:lvlText w:val=""/>
+      <w:lvlJc w:val="left"/>
+      <w:pPr>
+        <w:tabs>
+          <w:tab w:val="num" w:pos="5760"/>
+        </w:tabs>
+        <w:ind w:left="5760" w:hanging="360"/>
+      </w:pPr>
+      <w:rPr>
+        <w:rFonts w:ascii="Wingdings" w:hAnsi="Wingdings" w:hint="default"/>
+        <w:sz w:val="20"/>
+      </w:rPr>
+    </w:lvl>
+    <w:lvl w:ilvl="8" w:tentative="1">
+      <w:start w:val="1"/>
+      <w:numFmt w:val="bullet"/>
+      <w:lvlText w:val=""/>
+      <w:lvlJc w:val="left"/>
+      <w:pPr>
+        <w:tabs>
+          <w:tab w:val="num" w:pos="6480"/>
+        </w:tabs>
+        <w:ind w:left="6480" w:hanging="360"/>
+      </w:pPr>
+      <w:rPr>
+        <w:rFonts w:ascii="Wingdings" w:hAnsi="Wingdings" w:hint="default"/>
+        <w:sz w:val="20"/>
+      </w:rPr>
+    </w:lvl>
+  </w:abstractNum>
+  <w:abstractNum w:abstractNumId="5" w15:restartNumberingAfterBreak="0">
+    <w:nsid w:val="3B491B34"/>
+    <w:multiLevelType w:val="hybridMultilevel"/>
+    <w:tmpl w:val="7B8E8C9C"/>
+    <w:lvl w:ilvl="0" w:tplc="0C090001">
+      <w:start w:val="1"/>
+      <w:numFmt w:val="bullet"/>
+      <w:lvlText w:val=""/>
+      <w:lvlJc w:val="left"/>
+      <w:pPr>
+        <w:ind w:left="1080" w:hanging="360"/>
+      </w:pPr>
+      <w:rPr>
+        <w:rFonts w:ascii="Symbol" w:hAnsi="Symbol" w:hint="default"/>
+      </w:rPr>
+    </w:lvl>
+    <w:lvl w:ilvl="1" w:tplc="0C090003" w:tentative="1">
+      <w:start w:val="1"/>
+      <w:numFmt w:val="bullet"/>
+      <w:lvlText w:val="o"/>
+      <w:lvlJc w:val="left"/>
+      <w:pPr>
+        <w:ind w:left="1800" w:hanging="360"/>
+      </w:pPr>
+      <w:rPr>
+        <w:rFonts w:ascii="Courier New" w:hAnsi="Courier New" w:cs="Courier New" w:hint="default"/>
+      </w:rPr>
+    </w:lvl>
+    <w:lvl w:ilvl="2" w:tplc="0C090005" w:tentative="1">
+      <w:start w:val="1"/>
+      <w:numFmt w:val="bullet"/>
+      <w:lvlText w:val=""/>
+      <w:lvlJc w:val="left"/>
+      <w:pPr>
+        <w:ind w:left="2520" w:hanging="360"/>
+      </w:pPr>
+      <w:rPr>
+        <w:rFonts w:ascii="Wingdings" w:hAnsi="Wingdings" w:hint="default"/>
+      </w:rPr>
+    </w:lvl>
+    <w:lvl w:ilvl="3" w:tplc="0C090001" w:tentative="1">
+      <w:start w:val="1"/>
+      <w:numFmt w:val="bullet"/>
+      <w:lvlText w:val=""/>
+      <w:lvlJc w:val="left"/>
+      <w:pPr>
+        <w:ind w:left="3240" w:hanging="360"/>
+      </w:pPr>
+      <w:rPr>
+        <w:rFonts w:ascii="Symbol" w:hAnsi="Symbol" w:hint="default"/>
+      </w:rPr>
+    </w:lvl>
+    <w:lvl w:ilvl="4" w:tplc="0C090003" w:tentative="1">
+      <w:start w:val="1"/>
+      <w:numFmt w:val="bullet"/>
+      <w:lvlText w:val="o"/>
+      <w:lvlJc w:val="left"/>
+      <w:pPr>
+        <w:ind w:left="3960" w:hanging="360"/>
+      </w:pPr>
+      <w:rPr>
+        <w:rFonts w:ascii="Courier New" w:hAnsi="Courier New" w:cs="Courier New" w:hint="default"/>
+      </w:rPr>
+    </w:lvl>
+    <w:lvl w:ilvl="5" w:tplc="0C090005" w:tentative="1">
+      <w:start w:val="1"/>
+      <w:numFmt w:val="bullet"/>
+      <w:lvlText w:val=""/>
+      <w:lvlJc w:val="left"/>
+      <w:pPr>
+        <w:ind w:left="4680" w:hanging="360"/>
+      </w:pPr>
+      <w:rPr>
+        <w:rFonts w:ascii="Wingdings" w:hAnsi="Wingdings" w:hint="default"/>
+      </w:rPr>
+    </w:lvl>
+    <w:lvl w:ilvl="6" w:tplc="0C090001" w:tentative="1">
+      <w:start w:val="1"/>
+      <w:numFmt w:val="bullet"/>
+      <w:lvlText w:val=""/>
+      <w:lvlJc w:val="left"/>
+      <w:pPr>
+        <w:ind w:left="5400" w:hanging="360"/>
+      </w:pPr>
+      <w:rPr>
+        <w:rFonts w:ascii="Symbol" w:hAnsi="Symbol" w:hint="default"/>
+      </w:rPr>
+    </w:lvl>
+    <w:lvl w:ilvl="7" w:tplc="0C090003" w:tentative="1">
+      <w:start w:val="1"/>
+      <w:numFmt w:val="bullet"/>
+      <w:lvlText w:val="o"/>
+      <w:lvlJc w:val="left"/>
+      <w:pPr>
+        <w:ind w:left="6120" w:hanging="360"/>
+      </w:pPr>
+      <w:rPr>
+        <w:rFonts w:ascii="Courier New" w:hAnsi="Courier New" w:cs="Courier New" w:hint="default"/>
+      </w:rPr>
+    </w:lvl>
+    <w:lvl w:ilvl="8" w:tplc="0C090005" w:tentative="1">
+      <w:start w:val="1"/>
+      <w:numFmt w:val="bullet"/>
+      <w:lvlText w:val=""/>
+      <w:lvlJc w:val="left"/>
+      <w:pPr>
+        <w:ind w:left="6840" w:hanging="360"/>
+      </w:pPr>
+      <w:rPr>
+        <w:rFonts w:ascii="Wingdings" w:hAnsi="Wingdings" w:hint="default"/>
+      </w:rPr>
+    </w:lvl>
+  </w:abstractNum>
+  <w:abstractNum w:abstractNumId="6" w15:restartNumberingAfterBreak="0">
     <w:nsid w:val="3D273BAB"/>
     <w:multiLevelType w:val="multilevel"/>
     <w:tmpl w:val="A91887AC"/>
@@ -941,7 +1962,531 @@
       </w:rPr>
     </w:lvl>
   </w:abstractNum>
-  <w:abstractNum w:abstractNumId="3" w15:restartNumberingAfterBreak="0">
+  <w:abstractNum w:abstractNumId="7" w15:restartNumberingAfterBreak="0">
+    <w:nsid w:val="41132E41"/>
+    <w:multiLevelType w:val="multilevel"/>
+    <w:tmpl w:val="51C0850E"/>
+    <w:lvl w:ilvl="0">
+      <w:start w:val="1"/>
+      <w:numFmt w:val="bullet"/>
+      <w:lvlText w:val=""/>
+      <w:lvlJc w:val="left"/>
+      <w:pPr>
+        <w:tabs>
+          <w:tab w:val="num" w:pos="720"/>
+        </w:tabs>
+        <w:ind w:left="720" w:hanging="360"/>
+      </w:pPr>
+      <w:rPr>
+        <w:rFonts w:ascii="Symbol" w:hAnsi="Symbol" w:hint="default"/>
+        <w:sz w:val="20"/>
+      </w:rPr>
+    </w:lvl>
+    <w:lvl w:ilvl="1" w:tentative="1">
+      <w:start w:val="1"/>
+      <w:numFmt w:val="bullet"/>
+      <w:lvlText w:val="o"/>
+      <w:lvlJc w:val="left"/>
+      <w:pPr>
+        <w:tabs>
+          <w:tab w:val="num" w:pos="1440"/>
+        </w:tabs>
+        <w:ind w:left="1440" w:hanging="360"/>
+      </w:pPr>
+      <w:rPr>
+        <w:rFonts w:ascii="Courier New" w:hAnsi="Courier New" w:hint="default"/>
+        <w:sz w:val="20"/>
+      </w:rPr>
+    </w:lvl>
+    <w:lvl w:ilvl="2" w:tentative="1">
+      <w:start w:val="1"/>
+      <w:numFmt w:val="bullet"/>
+      <w:lvlText w:val=""/>
+      <w:lvlJc w:val="left"/>
+      <w:pPr>
+        <w:tabs>
+          <w:tab w:val="num" w:pos="2160"/>
+        </w:tabs>
+        <w:ind w:left="2160" w:hanging="360"/>
+      </w:pPr>
+      <w:rPr>
+        <w:rFonts w:ascii="Wingdings" w:hAnsi="Wingdings" w:hint="default"/>
+        <w:sz w:val="20"/>
+      </w:rPr>
+    </w:lvl>
+    <w:lvl w:ilvl="3" w:tentative="1">
+      <w:start w:val="1"/>
+      <w:numFmt w:val="bullet"/>
+      <w:lvlText w:val=""/>
+      <w:lvlJc w:val="left"/>
+      <w:pPr>
+        <w:tabs>
+          <w:tab w:val="num" w:pos="2880"/>
+        </w:tabs>
+        <w:ind w:left="2880" w:hanging="360"/>
+      </w:pPr>
+      <w:rPr>
+        <w:rFonts w:ascii="Wingdings" w:hAnsi="Wingdings" w:hint="default"/>
+        <w:sz w:val="20"/>
+      </w:rPr>
+    </w:lvl>
+    <w:lvl w:ilvl="4" w:tentative="1">
+      <w:start w:val="1"/>
+      <w:numFmt w:val="bullet"/>
+      <w:lvlText w:val=""/>
+      <w:lvlJc w:val="left"/>
+      <w:pPr>
+        <w:tabs>
+          <w:tab w:val="num" w:pos="3600"/>
+        </w:tabs>
+        <w:ind w:left="3600" w:hanging="360"/>
+      </w:pPr>
+      <w:rPr>
+        <w:rFonts w:ascii="Wingdings" w:hAnsi="Wingdings" w:hint="default"/>
+        <w:sz w:val="20"/>
+      </w:rPr>
+    </w:lvl>
+    <w:lvl w:ilvl="5" w:tentative="1">
+      <w:start w:val="1"/>
+      <w:numFmt w:val="bullet"/>
+      <w:lvlText w:val=""/>
+      <w:lvlJc w:val="left"/>
+      <w:pPr>
+        <w:tabs>
+          <w:tab w:val="num" w:pos="4320"/>
+        </w:tabs>
+        <w:ind w:left="4320" w:hanging="360"/>
+      </w:pPr>
+      <w:rPr>
+        <w:rFonts w:ascii="Wingdings" w:hAnsi="Wingdings" w:hint="default"/>
+        <w:sz w:val="20"/>
+      </w:rPr>
+    </w:lvl>
+    <w:lvl w:ilvl="6" w:tentative="1">
+      <w:start w:val="1"/>
+      <w:numFmt w:val="bullet"/>
+      <w:lvlText w:val=""/>
+      <w:lvlJc w:val="left"/>
+      <w:pPr>
+        <w:tabs>
+          <w:tab w:val="num" w:pos="5040"/>
+        </w:tabs>
+        <w:ind w:left="5040" w:hanging="360"/>
+      </w:pPr>
+      <w:rPr>
+        <w:rFonts w:ascii="Wingdings" w:hAnsi="Wingdings" w:hint="default"/>
+        <w:sz w:val="20"/>
+      </w:rPr>
+    </w:lvl>
+    <w:lvl w:ilvl="7" w:tentative="1">
+      <w:start w:val="1"/>
+      <w:numFmt w:val="bullet"/>
+      <w:lvlText w:val=""/>
+      <w:lvlJc w:val="left"/>
+      <w:pPr>
+        <w:tabs>
+          <w:tab w:val="num" w:pos="5760"/>
+        </w:tabs>
+        <w:ind w:left="5760" w:hanging="360"/>
+      </w:pPr>
+      <w:rPr>
+        <w:rFonts w:ascii="Wingdings" w:hAnsi="Wingdings" w:hint="default"/>
+        <w:sz w:val="20"/>
+      </w:rPr>
+    </w:lvl>
+    <w:lvl w:ilvl="8" w:tentative="1">
+      <w:start w:val="1"/>
+      <w:numFmt w:val="bullet"/>
+      <w:lvlText w:val=""/>
+      <w:lvlJc w:val="left"/>
+      <w:pPr>
+        <w:tabs>
+          <w:tab w:val="num" w:pos="6480"/>
+        </w:tabs>
+        <w:ind w:left="6480" w:hanging="360"/>
+      </w:pPr>
+      <w:rPr>
+        <w:rFonts w:ascii="Wingdings" w:hAnsi="Wingdings" w:hint="default"/>
+        <w:sz w:val="20"/>
+      </w:rPr>
+    </w:lvl>
+  </w:abstractNum>
+  <w:abstractNum w:abstractNumId="8" w15:restartNumberingAfterBreak="0">
+    <w:nsid w:val="48DD16A9"/>
+    <w:multiLevelType w:val="multilevel"/>
+    <w:tmpl w:val="EC16BA48"/>
+    <w:lvl w:ilvl="0">
+      <w:start w:val="1"/>
+      <w:numFmt w:val="bullet"/>
+      <w:lvlText w:val=""/>
+      <w:lvlJc w:val="left"/>
+      <w:pPr>
+        <w:tabs>
+          <w:tab w:val="num" w:pos="720"/>
+        </w:tabs>
+        <w:ind w:left="720" w:hanging="360"/>
+      </w:pPr>
+      <w:rPr>
+        <w:rFonts w:ascii="Symbol" w:hAnsi="Symbol" w:hint="default"/>
+        <w:sz w:val="20"/>
+      </w:rPr>
+    </w:lvl>
+    <w:lvl w:ilvl="1" w:tentative="1">
+      <w:start w:val="1"/>
+      <w:numFmt w:val="bullet"/>
+      <w:lvlText w:val="o"/>
+      <w:lvlJc w:val="left"/>
+      <w:pPr>
+        <w:tabs>
+          <w:tab w:val="num" w:pos="1440"/>
+        </w:tabs>
+        <w:ind w:left="1440" w:hanging="360"/>
+      </w:pPr>
+      <w:rPr>
+        <w:rFonts w:ascii="Courier New" w:hAnsi="Courier New" w:hint="default"/>
+        <w:sz w:val="20"/>
+      </w:rPr>
+    </w:lvl>
+    <w:lvl w:ilvl="2" w:tentative="1">
+      <w:start w:val="1"/>
+      <w:numFmt w:val="bullet"/>
+      <w:lvlText w:val=""/>
+      <w:lvlJc w:val="left"/>
+      <w:pPr>
+        <w:tabs>
+          <w:tab w:val="num" w:pos="2160"/>
+        </w:tabs>
+        <w:ind w:left="2160" w:hanging="360"/>
+      </w:pPr>
+      <w:rPr>
+        <w:rFonts w:ascii="Wingdings" w:hAnsi="Wingdings" w:hint="default"/>
+        <w:sz w:val="20"/>
+      </w:rPr>
+    </w:lvl>
+    <w:lvl w:ilvl="3" w:tentative="1">
+      <w:start w:val="1"/>
+      <w:numFmt w:val="bullet"/>
+      <w:lvlText w:val=""/>
+      <w:lvlJc w:val="left"/>
+      <w:pPr>
+        <w:tabs>
+          <w:tab w:val="num" w:pos="2880"/>
+        </w:tabs>
+        <w:ind w:left="2880" w:hanging="360"/>
+      </w:pPr>
+      <w:rPr>
+        <w:rFonts w:ascii="Wingdings" w:hAnsi="Wingdings" w:hint="default"/>
+        <w:sz w:val="20"/>
+      </w:rPr>
+    </w:lvl>
+    <w:lvl w:ilvl="4" w:tentative="1">
+      <w:start w:val="1"/>
+      <w:numFmt w:val="bullet"/>
+      <w:lvlText w:val=""/>
+      <w:lvlJc w:val="left"/>
+      <w:pPr>
+        <w:tabs>
+          <w:tab w:val="num" w:pos="3600"/>
+        </w:tabs>
+        <w:ind w:left="3600" w:hanging="360"/>
+      </w:pPr>
+      <w:rPr>
+        <w:rFonts w:ascii="Wingdings" w:hAnsi="Wingdings" w:hint="default"/>
+        <w:sz w:val="20"/>
+      </w:rPr>
+    </w:lvl>
+    <w:lvl w:ilvl="5" w:tentative="1">
+      <w:start w:val="1"/>
+      <w:numFmt w:val="bullet"/>
+      <w:lvlText w:val=""/>
+      <w:lvlJc w:val="left"/>
+      <w:pPr>
+        <w:tabs>
+          <w:tab w:val="num" w:pos="4320"/>
+        </w:tabs>
+        <w:ind w:left="4320" w:hanging="360"/>
+      </w:pPr>
+      <w:rPr>
+        <w:rFonts w:ascii="Wingdings" w:hAnsi="Wingdings" w:hint="default"/>
+        <w:sz w:val="20"/>
+      </w:rPr>
+    </w:lvl>
+    <w:lvl w:ilvl="6" w:tentative="1">
+      <w:start w:val="1"/>
+      <w:numFmt w:val="bullet"/>
+      <w:lvlText w:val=""/>
+      <w:lvlJc w:val="left"/>
+      <w:pPr>
+        <w:tabs>
+          <w:tab w:val="num" w:pos="5040"/>
+        </w:tabs>
+        <w:ind w:left="5040" w:hanging="360"/>
+      </w:pPr>
+      <w:rPr>
+        <w:rFonts w:ascii="Wingdings" w:hAnsi="Wingdings" w:hint="default"/>
+        <w:sz w:val="20"/>
+      </w:rPr>
+    </w:lvl>
+    <w:lvl w:ilvl="7" w:tentative="1">
+      <w:start w:val="1"/>
+      <w:numFmt w:val="bullet"/>
+      <w:lvlText w:val=""/>
+      <w:lvlJc w:val="left"/>
+      <w:pPr>
+        <w:tabs>
+          <w:tab w:val="num" w:pos="5760"/>
+        </w:tabs>
+        <w:ind w:left="5760" w:hanging="360"/>
+      </w:pPr>
+      <w:rPr>
+        <w:rFonts w:ascii="Wingdings" w:hAnsi="Wingdings" w:hint="default"/>
+        <w:sz w:val="20"/>
+      </w:rPr>
+    </w:lvl>
+    <w:lvl w:ilvl="8" w:tentative="1">
+      <w:start w:val="1"/>
+      <w:numFmt w:val="bullet"/>
+      <w:lvlText w:val=""/>
+      <w:lvlJc w:val="left"/>
+      <w:pPr>
+        <w:tabs>
+          <w:tab w:val="num" w:pos="6480"/>
+        </w:tabs>
+        <w:ind w:left="6480" w:hanging="360"/>
+      </w:pPr>
+      <w:rPr>
+        <w:rFonts w:ascii="Wingdings" w:hAnsi="Wingdings" w:hint="default"/>
+        <w:sz w:val="20"/>
+      </w:rPr>
+    </w:lvl>
+  </w:abstractNum>
+  <w:abstractNum w:abstractNumId="9" w15:restartNumberingAfterBreak="0">
+    <w:nsid w:val="49725832"/>
+    <w:multiLevelType w:val="hybridMultilevel"/>
+    <w:tmpl w:val="A198D4AC"/>
+    <w:lvl w:ilvl="0" w:tplc="0C090001">
+      <w:start w:val="1"/>
+      <w:numFmt w:val="bullet"/>
+      <w:lvlText w:val=""/>
+      <w:lvlJc w:val="left"/>
+      <w:pPr>
+        <w:ind w:left="720" w:hanging="360"/>
+      </w:pPr>
+      <w:rPr>
+        <w:rFonts w:ascii="Symbol" w:hAnsi="Symbol" w:hint="default"/>
+      </w:rPr>
+    </w:lvl>
+    <w:lvl w:ilvl="1" w:tplc="0C090003" w:tentative="1">
+      <w:start w:val="1"/>
+      <w:numFmt w:val="bullet"/>
+      <w:lvlText w:val="o"/>
+      <w:lvlJc w:val="left"/>
+      <w:pPr>
+        <w:ind w:left="1440" w:hanging="360"/>
+      </w:pPr>
+      <w:rPr>
+        <w:rFonts w:ascii="Courier New" w:hAnsi="Courier New" w:cs="Courier New" w:hint="default"/>
+      </w:rPr>
+    </w:lvl>
+    <w:lvl w:ilvl="2" w:tplc="0C090005" w:tentative="1">
+      <w:start w:val="1"/>
+      <w:numFmt w:val="bullet"/>
+      <w:lvlText w:val=""/>
+      <w:lvlJc w:val="left"/>
+      <w:pPr>
+        <w:ind w:left="2160" w:hanging="360"/>
+      </w:pPr>
+      <w:rPr>
+        <w:rFonts w:ascii="Wingdings" w:hAnsi="Wingdings" w:hint="default"/>
+      </w:rPr>
+    </w:lvl>
+    <w:lvl w:ilvl="3" w:tplc="0C090001" w:tentative="1">
+      <w:start w:val="1"/>
+      <w:numFmt w:val="bullet"/>
+      <w:lvlText w:val=""/>
+      <w:lvlJc w:val="left"/>
+      <w:pPr>
+        <w:ind w:left="2880" w:hanging="360"/>
+      </w:pPr>
+      <w:rPr>
+        <w:rFonts w:ascii="Symbol" w:hAnsi="Symbol" w:hint="default"/>
+      </w:rPr>
+    </w:lvl>
+    <w:lvl w:ilvl="4" w:tplc="0C090003" w:tentative="1">
+      <w:start w:val="1"/>
+      <w:numFmt w:val="bullet"/>
+      <w:lvlText w:val="o"/>
+      <w:lvlJc w:val="left"/>
+      <w:pPr>
+        <w:ind w:left="3600" w:hanging="360"/>
+      </w:pPr>
+      <w:rPr>
+        <w:rFonts w:ascii="Courier New" w:hAnsi="Courier New" w:cs="Courier New" w:hint="default"/>
+      </w:rPr>
+    </w:lvl>
+    <w:lvl w:ilvl="5" w:tplc="0C090005" w:tentative="1">
+      <w:start w:val="1"/>
+      <w:numFmt w:val="bullet"/>
+      <w:lvlText w:val=""/>
+      <w:lvlJc w:val="left"/>
+      <w:pPr>
+        <w:ind w:left="4320" w:hanging="360"/>
+      </w:pPr>
+      <w:rPr>
+        <w:rFonts w:ascii="Wingdings" w:hAnsi="Wingdings" w:hint="default"/>
+      </w:rPr>
+    </w:lvl>
+    <w:lvl w:ilvl="6" w:tplc="0C090001" w:tentative="1">
+      <w:start w:val="1"/>
+      <w:numFmt w:val="bullet"/>
+      <w:lvlText w:val=""/>
+      <w:lvlJc w:val="left"/>
+      <w:pPr>
+        <w:ind w:left="5040" w:hanging="360"/>
+      </w:pPr>
+      <w:rPr>
+        <w:rFonts w:ascii="Symbol" w:hAnsi="Symbol" w:hint="default"/>
+      </w:rPr>
+    </w:lvl>
+    <w:lvl w:ilvl="7" w:tplc="0C090003" w:tentative="1">
+      <w:start w:val="1"/>
+      <w:numFmt w:val="bullet"/>
+      <w:lvlText w:val="o"/>
+      <w:lvlJc w:val="left"/>
+      <w:pPr>
+        <w:ind w:left="5760" w:hanging="360"/>
+      </w:pPr>
+      <w:rPr>
+        <w:rFonts w:ascii="Courier New" w:hAnsi="Courier New" w:cs="Courier New" w:hint="default"/>
+      </w:rPr>
+    </w:lvl>
+    <w:lvl w:ilvl="8" w:tplc="0C090005" w:tentative="1">
+      <w:start w:val="1"/>
+      <w:numFmt w:val="bullet"/>
+      <w:lvlText w:val=""/>
+      <w:lvlJc w:val="left"/>
+      <w:pPr>
+        <w:ind w:left="6480" w:hanging="360"/>
+      </w:pPr>
+      <w:rPr>
+        <w:rFonts w:ascii="Wingdings" w:hAnsi="Wingdings" w:hint="default"/>
+      </w:rPr>
+    </w:lvl>
+  </w:abstractNum>
+  <w:abstractNum w:abstractNumId="10" w15:restartNumberingAfterBreak="0">
+    <w:nsid w:val="50A92D8F"/>
+    <w:multiLevelType w:val="hybridMultilevel"/>
+    <w:tmpl w:val="1C009DD6"/>
+    <w:lvl w:ilvl="0" w:tplc="0C090001">
+      <w:start w:val="1"/>
+      <w:numFmt w:val="bullet"/>
+      <w:lvlText w:val=""/>
+      <w:lvlJc w:val="left"/>
+      <w:pPr>
+        <w:ind w:left="720" w:hanging="360"/>
+      </w:pPr>
+      <w:rPr>
+        <w:rFonts w:ascii="Symbol" w:hAnsi="Symbol" w:hint="default"/>
+      </w:rPr>
+    </w:lvl>
+    <w:lvl w:ilvl="1" w:tplc="0C090003" w:tentative="1">
+      <w:start w:val="1"/>
+      <w:numFmt w:val="bullet"/>
+      <w:lvlText w:val="o"/>
+      <w:lvlJc w:val="left"/>
+      <w:pPr>
+        <w:ind w:left="1440" w:hanging="360"/>
+      </w:pPr>
+      <w:rPr>
+        <w:rFonts w:ascii="Courier New" w:hAnsi="Courier New" w:cs="Courier New" w:hint="default"/>
+      </w:rPr>
+    </w:lvl>
+    <w:lvl w:ilvl="2" w:tplc="0C090005" w:tentative="1">
+      <w:start w:val="1"/>
+      <w:numFmt w:val="bullet"/>
+      <w:lvlText w:val=""/>
+      <w:lvlJc w:val="left"/>
+      <w:pPr>
+        <w:ind w:left="2160" w:hanging="360"/>
+      </w:pPr>
+      <w:rPr>
+        <w:rFonts w:ascii="Wingdings" w:hAnsi="Wingdings" w:hint="default"/>
+      </w:rPr>
+    </w:lvl>
+    <w:lvl w:ilvl="3" w:tplc="0C090001" w:tentative="1">
+      <w:start w:val="1"/>
+      <w:numFmt w:val="bullet"/>
+      <w:lvlText w:val=""/>
+      <w:lvlJc w:val="left"/>
+      <w:pPr>
+        <w:ind w:left="2880" w:hanging="360"/>
+      </w:pPr>
+      <w:rPr>
+        <w:rFonts w:ascii="Symbol" w:hAnsi="Symbol" w:hint="default"/>
+      </w:rPr>
+    </w:lvl>
+    <w:lvl w:ilvl="4" w:tplc="0C090003" w:tentative="1">
+      <w:start w:val="1"/>
+      <w:numFmt w:val="bullet"/>
+      <w:lvlText w:val="o"/>
+      <w:lvlJc w:val="left"/>
+      <w:pPr>
+        <w:ind w:left="3600" w:hanging="360"/>
+      </w:pPr>
+      <w:rPr>
+        <w:rFonts w:ascii="Courier New" w:hAnsi="Courier New" w:cs="Courier New" w:hint="default"/>
+      </w:rPr>
+    </w:lvl>
+    <w:lvl w:ilvl="5" w:tplc="0C090005" w:tentative="1">
+      <w:start w:val="1"/>
+      <w:numFmt w:val="bullet"/>
+      <w:lvlText w:val=""/>
+      <w:lvlJc w:val="left"/>
+      <w:pPr>
+        <w:ind w:left="4320" w:hanging="360"/>
+      </w:pPr>
+      <w:rPr>
+        <w:rFonts w:ascii="Wingdings" w:hAnsi="Wingdings" w:hint="default"/>
+      </w:rPr>
+    </w:lvl>
+    <w:lvl w:ilvl="6" w:tplc="0C090001" w:tentative="1">
+      <w:start w:val="1"/>
+      <w:numFmt w:val="bullet"/>
+      <w:lvlText w:val=""/>
+      <w:lvlJc w:val="left"/>
+      <w:pPr>
+        <w:ind w:left="5040" w:hanging="360"/>
+      </w:pPr>
+      <w:rPr>
+        <w:rFonts w:ascii="Symbol" w:hAnsi="Symbol" w:hint="default"/>
+      </w:rPr>
+    </w:lvl>
+    <w:lvl w:ilvl="7" w:tplc="0C090003" w:tentative="1">
+      <w:start w:val="1"/>
+      <w:numFmt w:val="bullet"/>
+      <w:lvlText w:val="o"/>
+      <w:lvlJc w:val="left"/>
+      <w:pPr>
+        <w:ind w:left="5760" w:hanging="360"/>
+      </w:pPr>
+      <w:rPr>
+        <w:rFonts w:ascii="Courier New" w:hAnsi="Courier New" w:cs="Courier New" w:hint="default"/>
+      </w:rPr>
+    </w:lvl>
+    <w:lvl w:ilvl="8" w:tplc="0C090005" w:tentative="1">
+      <w:start w:val="1"/>
+      <w:numFmt w:val="bullet"/>
+      <w:lvlText w:val=""/>
+      <w:lvlJc w:val="left"/>
+      <w:pPr>
+        <w:ind w:left="6480" w:hanging="360"/>
+      </w:pPr>
+      <w:rPr>
+        <w:rFonts w:ascii="Wingdings" w:hAnsi="Wingdings" w:hint="default"/>
+      </w:rPr>
+    </w:lvl>
+  </w:abstractNum>
+  <w:abstractNum w:abstractNumId="11" w15:restartNumberingAfterBreak="0">
     <w:nsid w:val="518B794E"/>
     <w:multiLevelType w:val="multilevel"/>
     <w:tmpl w:val="FF760382"/>
@@ -1090,7 +2635,531 @@
       </w:rPr>
     </w:lvl>
   </w:abstractNum>
-  <w:abstractNum w:abstractNumId="4" w15:restartNumberingAfterBreak="0">
+  <w:abstractNum w:abstractNumId="12" w15:restartNumberingAfterBreak="0">
+    <w:nsid w:val="53DC76E5"/>
+    <w:multiLevelType w:val="multilevel"/>
+    <w:tmpl w:val="F23EFAE6"/>
+    <w:lvl w:ilvl="0">
+      <w:start w:val="1"/>
+      <w:numFmt w:val="bullet"/>
+      <w:lvlText w:val=""/>
+      <w:lvlJc w:val="left"/>
+      <w:pPr>
+        <w:tabs>
+          <w:tab w:val="num" w:pos="720"/>
+        </w:tabs>
+        <w:ind w:left="720" w:hanging="360"/>
+      </w:pPr>
+      <w:rPr>
+        <w:rFonts w:ascii="Symbol" w:hAnsi="Symbol" w:hint="default"/>
+        <w:sz w:val="20"/>
+      </w:rPr>
+    </w:lvl>
+    <w:lvl w:ilvl="1" w:tentative="1">
+      <w:start w:val="1"/>
+      <w:numFmt w:val="bullet"/>
+      <w:lvlText w:val="o"/>
+      <w:lvlJc w:val="left"/>
+      <w:pPr>
+        <w:tabs>
+          <w:tab w:val="num" w:pos="1440"/>
+        </w:tabs>
+        <w:ind w:left="1440" w:hanging="360"/>
+      </w:pPr>
+      <w:rPr>
+        <w:rFonts w:ascii="Courier New" w:hAnsi="Courier New" w:hint="default"/>
+        <w:sz w:val="20"/>
+      </w:rPr>
+    </w:lvl>
+    <w:lvl w:ilvl="2" w:tentative="1">
+      <w:start w:val="1"/>
+      <w:numFmt w:val="bullet"/>
+      <w:lvlText w:val=""/>
+      <w:lvlJc w:val="left"/>
+      <w:pPr>
+        <w:tabs>
+          <w:tab w:val="num" w:pos="2160"/>
+        </w:tabs>
+        <w:ind w:left="2160" w:hanging="360"/>
+      </w:pPr>
+      <w:rPr>
+        <w:rFonts w:ascii="Wingdings" w:hAnsi="Wingdings" w:hint="default"/>
+        <w:sz w:val="20"/>
+      </w:rPr>
+    </w:lvl>
+    <w:lvl w:ilvl="3" w:tentative="1">
+      <w:start w:val="1"/>
+      <w:numFmt w:val="bullet"/>
+      <w:lvlText w:val=""/>
+      <w:lvlJc w:val="left"/>
+      <w:pPr>
+        <w:tabs>
+          <w:tab w:val="num" w:pos="2880"/>
+        </w:tabs>
+        <w:ind w:left="2880" w:hanging="360"/>
+      </w:pPr>
+      <w:rPr>
+        <w:rFonts w:ascii="Wingdings" w:hAnsi="Wingdings" w:hint="default"/>
+        <w:sz w:val="20"/>
+      </w:rPr>
+    </w:lvl>
+    <w:lvl w:ilvl="4" w:tentative="1">
+      <w:start w:val="1"/>
+      <w:numFmt w:val="bullet"/>
+      <w:lvlText w:val=""/>
+      <w:lvlJc w:val="left"/>
+      <w:pPr>
+        <w:tabs>
+          <w:tab w:val="num" w:pos="3600"/>
+        </w:tabs>
+        <w:ind w:left="3600" w:hanging="360"/>
+      </w:pPr>
+      <w:rPr>
+        <w:rFonts w:ascii="Wingdings" w:hAnsi="Wingdings" w:hint="default"/>
+        <w:sz w:val="20"/>
+      </w:rPr>
+    </w:lvl>
+    <w:lvl w:ilvl="5" w:tentative="1">
+      <w:start w:val="1"/>
+      <w:numFmt w:val="bullet"/>
+      <w:lvlText w:val=""/>
+      <w:lvlJc w:val="left"/>
+      <w:pPr>
+        <w:tabs>
+          <w:tab w:val="num" w:pos="4320"/>
+        </w:tabs>
+        <w:ind w:left="4320" w:hanging="360"/>
+      </w:pPr>
+      <w:rPr>
+        <w:rFonts w:ascii="Wingdings" w:hAnsi="Wingdings" w:hint="default"/>
+        <w:sz w:val="20"/>
+      </w:rPr>
+    </w:lvl>
+    <w:lvl w:ilvl="6" w:tentative="1">
+      <w:start w:val="1"/>
+      <w:numFmt w:val="bullet"/>
+      <w:lvlText w:val=""/>
+      <w:lvlJc w:val="left"/>
+      <w:pPr>
+        <w:tabs>
+          <w:tab w:val="num" w:pos="5040"/>
+        </w:tabs>
+        <w:ind w:left="5040" w:hanging="360"/>
+      </w:pPr>
+      <w:rPr>
+        <w:rFonts w:ascii="Wingdings" w:hAnsi="Wingdings" w:hint="default"/>
+        <w:sz w:val="20"/>
+      </w:rPr>
+    </w:lvl>
+    <w:lvl w:ilvl="7" w:tentative="1">
+      <w:start w:val="1"/>
+      <w:numFmt w:val="bullet"/>
+      <w:lvlText w:val=""/>
+      <w:lvlJc w:val="left"/>
+      <w:pPr>
+        <w:tabs>
+          <w:tab w:val="num" w:pos="5760"/>
+        </w:tabs>
+        <w:ind w:left="5760" w:hanging="360"/>
+      </w:pPr>
+      <w:rPr>
+        <w:rFonts w:ascii="Wingdings" w:hAnsi="Wingdings" w:hint="default"/>
+        <w:sz w:val="20"/>
+      </w:rPr>
+    </w:lvl>
+    <w:lvl w:ilvl="8" w:tentative="1">
+      <w:start w:val="1"/>
+      <w:numFmt w:val="bullet"/>
+      <w:lvlText w:val=""/>
+      <w:lvlJc w:val="left"/>
+      <w:pPr>
+        <w:tabs>
+          <w:tab w:val="num" w:pos="6480"/>
+        </w:tabs>
+        <w:ind w:left="6480" w:hanging="360"/>
+      </w:pPr>
+      <w:rPr>
+        <w:rFonts w:ascii="Wingdings" w:hAnsi="Wingdings" w:hint="default"/>
+        <w:sz w:val="20"/>
+      </w:rPr>
+    </w:lvl>
+  </w:abstractNum>
+  <w:abstractNum w:abstractNumId="13" w15:restartNumberingAfterBreak="0">
+    <w:nsid w:val="56747492"/>
+    <w:multiLevelType w:val="hybridMultilevel"/>
+    <w:tmpl w:val="897A823C"/>
+    <w:lvl w:ilvl="0" w:tplc="0C090001">
+      <w:start w:val="1"/>
+      <w:numFmt w:val="bullet"/>
+      <w:lvlText w:val=""/>
+      <w:lvlJc w:val="left"/>
+      <w:pPr>
+        <w:ind w:left="720" w:hanging="360"/>
+      </w:pPr>
+      <w:rPr>
+        <w:rFonts w:ascii="Symbol" w:hAnsi="Symbol" w:hint="default"/>
+      </w:rPr>
+    </w:lvl>
+    <w:lvl w:ilvl="1" w:tplc="0C090003" w:tentative="1">
+      <w:start w:val="1"/>
+      <w:numFmt w:val="bullet"/>
+      <w:lvlText w:val="o"/>
+      <w:lvlJc w:val="left"/>
+      <w:pPr>
+        <w:ind w:left="1440" w:hanging="360"/>
+      </w:pPr>
+      <w:rPr>
+        <w:rFonts w:ascii="Courier New" w:hAnsi="Courier New" w:cs="Courier New" w:hint="default"/>
+      </w:rPr>
+    </w:lvl>
+    <w:lvl w:ilvl="2" w:tplc="0C090005" w:tentative="1">
+      <w:start w:val="1"/>
+      <w:numFmt w:val="bullet"/>
+      <w:lvlText w:val=""/>
+      <w:lvlJc w:val="left"/>
+      <w:pPr>
+        <w:ind w:left="2160" w:hanging="360"/>
+      </w:pPr>
+      <w:rPr>
+        <w:rFonts w:ascii="Wingdings" w:hAnsi="Wingdings" w:hint="default"/>
+      </w:rPr>
+    </w:lvl>
+    <w:lvl w:ilvl="3" w:tplc="0C090001" w:tentative="1">
+      <w:start w:val="1"/>
+      <w:numFmt w:val="bullet"/>
+      <w:lvlText w:val=""/>
+      <w:lvlJc w:val="left"/>
+      <w:pPr>
+        <w:ind w:left="2880" w:hanging="360"/>
+      </w:pPr>
+      <w:rPr>
+        <w:rFonts w:ascii="Symbol" w:hAnsi="Symbol" w:hint="default"/>
+      </w:rPr>
+    </w:lvl>
+    <w:lvl w:ilvl="4" w:tplc="0C090003" w:tentative="1">
+      <w:start w:val="1"/>
+      <w:numFmt w:val="bullet"/>
+      <w:lvlText w:val="o"/>
+      <w:lvlJc w:val="left"/>
+      <w:pPr>
+        <w:ind w:left="3600" w:hanging="360"/>
+      </w:pPr>
+      <w:rPr>
+        <w:rFonts w:ascii="Courier New" w:hAnsi="Courier New" w:cs="Courier New" w:hint="default"/>
+      </w:rPr>
+    </w:lvl>
+    <w:lvl w:ilvl="5" w:tplc="0C090005" w:tentative="1">
+      <w:start w:val="1"/>
+      <w:numFmt w:val="bullet"/>
+      <w:lvlText w:val=""/>
+      <w:lvlJc w:val="left"/>
+      <w:pPr>
+        <w:ind w:left="4320" w:hanging="360"/>
+      </w:pPr>
+      <w:rPr>
+        <w:rFonts w:ascii="Wingdings" w:hAnsi="Wingdings" w:hint="default"/>
+      </w:rPr>
+    </w:lvl>
+    <w:lvl w:ilvl="6" w:tplc="0C090001" w:tentative="1">
+      <w:start w:val="1"/>
+      <w:numFmt w:val="bullet"/>
+      <w:lvlText w:val=""/>
+      <w:lvlJc w:val="left"/>
+      <w:pPr>
+        <w:ind w:left="5040" w:hanging="360"/>
+      </w:pPr>
+      <w:rPr>
+        <w:rFonts w:ascii="Symbol" w:hAnsi="Symbol" w:hint="default"/>
+      </w:rPr>
+    </w:lvl>
+    <w:lvl w:ilvl="7" w:tplc="0C090003" w:tentative="1">
+      <w:start w:val="1"/>
+      <w:numFmt w:val="bullet"/>
+      <w:lvlText w:val="o"/>
+      <w:lvlJc w:val="left"/>
+      <w:pPr>
+        <w:ind w:left="5760" w:hanging="360"/>
+      </w:pPr>
+      <w:rPr>
+        <w:rFonts w:ascii="Courier New" w:hAnsi="Courier New" w:cs="Courier New" w:hint="default"/>
+      </w:rPr>
+    </w:lvl>
+    <w:lvl w:ilvl="8" w:tplc="0C090005" w:tentative="1">
+      <w:start w:val="1"/>
+      <w:numFmt w:val="bullet"/>
+      <w:lvlText w:val=""/>
+      <w:lvlJc w:val="left"/>
+      <w:pPr>
+        <w:ind w:left="6480" w:hanging="360"/>
+      </w:pPr>
+      <w:rPr>
+        <w:rFonts w:ascii="Wingdings" w:hAnsi="Wingdings" w:hint="default"/>
+      </w:rPr>
+    </w:lvl>
+  </w:abstractNum>
+  <w:abstractNum w:abstractNumId="14" w15:restartNumberingAfterBreak="0">
+    <w:nsid w:val="5BEE131F"/>
+    <w:multiLevelType w:val="hybridMultilevel"/>
+    <w:tmpl w:val="6AE0943A"/>
+    <w:lvl w:ilvl="0" w:tplc="0C090001">
+      <w:start w:val="1"/>
+      <w:numFmt w:val="bullet"/>
+      <w:lvlText w:val=""/>
+      <w:lvlJc w:val="left"/>
+      <w:pPr>
+        <w:ind w:left="720" w:hanging="360"/>
+      </w:pPr>
+      <w:rPr>
+        <w:rFonts w:ascii="Symbol" w:hAnsi="Symbol" w:hint="default"/>
+      </w:rPr>
+    </w:lvl>
+    <w:lvl w:ilvl="1" w:tplc="0C090003" w:tentative="1">
+      <w:start w:val="1"/>
+      <w:numFmt w:val="bullet"/>
+      <w:lvlText w:val="o"/>
+      <w:lvlJc w:val="left"/>
+      <w:pPr>
+        <w:ind w:left="1440" w:hanging="360"/>
+      </w:pPr>
+      <w:rPr>
+        <w:rFonts w:ascii="Courier New" w:hAnsi="Courier New" w:cs="Courier New" w:hint="default"/>
+      </w:rPr>
+    </w:lvl>
+    <w:lvl w:ilvl="2" w:tplc="0C090005" w:tentative="1">
+      <w:start w:val="1"/>
+      <w:numFmt w:val="bullet"/>
+      <w:lvlText w:val=""/>
+      <w:lvlJc w:val="left"/>
+      <w:pPr>
+        <w:ind w:left="2160" w:hanging="360"/>
+      </w:pPr>
+      <w:rPr>
+        <w:rFonts w:ascii="Wingdings" w:hAnsi="Wingdings" w:hint="default"/>
+      </w:rPr>
+    </w:lvl>
+    <w:lvl w:ilvl="3" w:tplc="0C090001" w:tentative="1">
+      <w:start w:val="1"/>
+      <w:numFmt w:val="bullet"/>
+      <w:lvlText w:val=""/>
+      <w:lvlJc w:val="left"/>
+      <w:pPr>
+        <w:ind w:left="2880" w:hanging="360"/>
+      </w:pPr>
+      <w:rPr>
+        <w:rFonts w:ascii="Symbol" w:hAnsi="Symbol" w:hint="default"/>
+      </w:rPr>
+    </w:lvl>
+    <w:lvl w:ilvl="4" w:tplc="0C090003" w:tentative="1">
+      <w:start w:val="1"/>
+      <w:numFmt w:val="bullet"/>
+      <w:lvlText w:val="o"/>
+      <w:lvlJc w:val="left"/>
+      <w:pPr>
+        <w:ind w:left="3600" w:hanging="360"/>
+      </w:pPr>
+      <w:rPr>
+        <w:rFonts w:ascii="Courier New" w:hAnsi="Courier New" w:cs="Courier New" w:hint="default"/>
+      </w:rPr>
+    </w:lvl>
+    <w:lvl w:ilvl="5" w:tplc="0C090005" w:tentative="1">
+      <w:start w:val="1"/>
+      <w:numFmt w:val="bullet"/>
+      <w:lvlText w:val=""/>
+      <w:lvlJc w:val="left"/>
+      <w:pPr>
+        <w:ind w:left="4320" w:hanging="360"/>
+      </w:pPr>
+      <w:rPr>
+        <w:rFonts w:ascii="Wingdings" w:hAnsi="Wingdings" w:hint="default"/>
+      </w:rPr>
+    </w:lvl>
+    <w:lvl w:ilvl="6" w:tplc="0C090001" w:tentative="1">
+      <w:start w:val="1"/>
+      <w:numFmt w:val="bullet"/>
+      <w:lvlText w:val=""/>
+      <w:lvlJc w:val="left"/>
+      <w:pPr>
+        <w:ind w:left="5040" w:hanging="360"/>
+      </w:pPr>
+      <w:rPr>
+        <w:rFonts w:ascii="Symbol" w:hAnsi="Symbol" w:hint="default"/>
+      </w:rPr>
+    </w:lvl>
+    <w:lvl w:ilvl="7" w:tplc="0C090003" w:tentative="1">
+      <w:start w:val="1"/>
+      <w:numFmt w:val="bullet"/>
+      <w:lvlText w:val="o"/>
+      <w:lvlJc w:val="left"/>
+      <w:pPr>
+        <w:ind w:left="5760" w:hanging="360"/>
+      </w:pPr>
+      <w:rPr>
+        <w:rFonts w:ascii="Courier New" w:hAnsi="Courier New" w:cs="Courier New" w:hint="default"/>
+      </w:rPr>
+    </w:lvl>
+    <w:lvl w:ilvl="8" w:tplc="0C090005" w:tentative="1">
+      <w:start w:val="1"/>
+      <w:numFmt w:val="bullet"/>
+      <w:lvlText w:val=""/>
+      <w:lvlJc w:val="left"/>
+      <w:pPr>
+        <w:ind w:left="6480" w:hanging="360"/>
+      </w:pPr>
+      <w:rPr>
+        <w:rFonts w:ascii="Wingdings" w:hAnsi="Wingdings" w:hint="default"/>
+      </w:rPr>
+    </w:lvl>
+  </w:abstractNum>
+  <w:abstractNum w:abstractNumId="15" w15:restartNumberingAfterBreak="0">
+    <w:nsid w:val="602B1FEF"/>
+    <w:multiLevelType w:val="multilevel"/>
+    <w:tmpl w:val="7F241E16"/>
+    <w:lvl w:ilvl="0">
+      <w:start w:val="1"/>
+      <w:numFmt w:val="bullet"/>
+      <w:lvlText w:val=""/>
+      <w:lvlJc w:val="left"/>
+      <w:pPr>
+        <w:tabs>
+          <w:tab w:val="num" w:pos="720"/>
+        </w:tabs>
+        <w:ind w:left="720" w:hanging="360"/>
+      </w:pPr>
+      <w:rPr>
+        <w:rFonts w:ascii="Symbol" w:hAnsi="Symbol" w:hint="default"/>
+        <w:sz w:val="20"/>
+      </w:rPr>
+    </w:lvl>
+    <w:lvl w:ilvl="1" w:tentative="1">
+      <w:start w:val="1"/>
+      <w:numFmt w:val="bullet"/>
+      <w:lvlText w:val="o"/>
+      <w:lvlJc w:val="left"/>
+      <w:pPr>
+        <w:tabs>
+          <w:tab w:val="num" w:pos="1440"/>
+        </w:tabs>
+        <w:ind w:left="1440" w:hanging="360"/>
+      </w:pPr>
+      <w:rPr>
+        <w:rFonts w:ascii="Courier New" w:hAnsi="Courier New" w:hint="default"/>
+        <w:sz w:val="20"/>
+      </w:rPr>
+    </w:lvl>
+    <w:lvl w:ilvl="2" w:tentative="1">
+      <w:start w:val="1"/>
+      <w:numFmt w:val="bullet"/>
+      <w:lvlText w:val=""/>
+      <w:lvlJc w:val="left"/>
+      <w:pPr>
+        <w:tabs>
+          <w:tab w:val="num" w:pos="2160"/>
+        </w:tabs>
+        <w:ind w:left="2160" w:hanging="360"/>
+      </w:pPr>
+      <w:rPr>
+        <w:rFonts w:ascii="Wingdings" w:hAnsi="Wingdings" w:hint="default"/>
+        <w:sz w:val="20"/>
+      </w:rPr>
+    </w:lvl>
+    <w:lvl w:ilvl="3" w:tentative="1">
+      <w:start w:val="1"/>
+      <w:numFmt w:val="bullet"/>
+      <w:lvlText w:val=""/>
+      <w:lvlJc w:val="left"/>
+      <w:pPr>
+        <w:tabs>
+          <w:tab w:val="num" w:pos="2880"/>
+        </w:tabs>
+        <w:ind w:left="2880" w:hanging="360"/>
+      </w:pPr>
+      <w:rPr>
+        <w:rFonts w:ascii="Wingdings" w:hAnsi="Wingdings" w:hint="default"/>
+        <w:sz w:val="20"/>
+      </w:rPr>
+    </w:lvl>
+    <w:lvl w:ilvl="4" w:tentative="1">
+      <w:start w:val="1"/>
+      <w:numFmt w:val="bullet"/>
+      <w:lvlText w:val=""/>
+      <w:lvlJc w:val="left"/>
+      <w:pPr>
+        <w:tabs>
+          <w:tab w:val="num" w:pos="3600"/>
+        </w:tabs>
+        <w:ind w:left="3600" w:hanging="360"/>
+      </w:pPr>
+      <w:rPr>
+        <w:rFonts w:ascii="Wingdings" w:hAnsi="Wingdings" w:hint="default"/>
+        <w:sz w:val="20"/>
+      </w:rPr>
+    </w:lvl>
+    <w:lvl w:ilvl="5" w:tentative="1">
+      <w:start w:val="1"/>
+      <w:numFmt w:val="bullet"/>
+      <w:lvlText w:val=""/>
+      <w:lvlJc w:val="left"/>
+      <w:pPr>
+        <w:tabs>
+          <w:tab w:val="num" w:pos="4320"/>
+        </w:tabs>
+        <w:ind w:left="4320" w:hanging="360"/>
+      </w:pPr>
+      <w:rPr>
+        <w:rFonts w:ascii="Wingdings" w:hAnsi="Wingdings" w:hint="default"/>
+        <w:sz w:val="20"/>
+      </w:rPr>
+    </w:lvl>
+    <w:lvl w:ilvl="6" w:tentative="1">
+      <w:start w:val="1"/>
+      <w:numFmt w:val="bullet"/>
+      <w:lvlText w:val=""/>
+      <w:lvlJc w:val="left"/>
+      <w:pPr>
+        <w:tabs>
+          <w:tab w:val="num" w:pos="5040"/>
+        </w:tabs>
+        <w:ind w:left="5040" w:hanging="360"/>
+      </w:pPr>
+      <w:rPr>
+        <w:rFonts w:ascii="Wingdings" w:hAnsi="Wingdings" w:hint="default"/>
+        <w:sz w:val="20"/>
+      </w:rPr>
+    </w:lvl>
+    <w:lvl w:ilvl="7" w:tentative="1">
+      <w:start w:val="1"/>
+      <w:numFmt w:val="bullet"/>
+      <w:lvlText w:val=""/>
+      <w:lvlJc w:val="left"/>
+      <w:pPr>
+        <w:tabs>
+          <w:tab w:val="num" w:pos="5760"/>
+        </w:tabs>
+        <w:ind w:left="5760" w:hanging="360"/>
+      </w:pPr>
+      <w:rPr>
+        <w:rFonts w:ascii="Wingdings" w:hAnsi="Wingdings" w:hint="default"/>
+        <w:sz w:val="20"/>
+      </w:rPr>
+    </w:lvl>
+    <w:lvl w:ilvl="8" w:tentative="1">
+      <w:start w:val="1"/>
+      <w:numFmt w:val="bullet"/>
+      <w:lvlText w:val=""/>
+      <w:lvlJc w:val="left"/>
+      <w:pPr>
+        <w:tabs>
+          <w:tab w:val="num" w:pos="6480"/>
+        </w:tabs>
+        <w:ind w:left="6480" w:hanging="360"/>
+      </w:pPr>
+      <w:rPr>
+        <w:rFonts w:ascii="Wingdings" w:hAnsi="Wingdings" w:hint="default"/>
+        <w:sz w:val="20"/>
+      </w:rPr>
+    </w:lvl>
+  </w:abstractNum>
+  <w:abstractNum w:abstractNumId="16" w15:restartNumberingAfterBreak="0">
     <w:nsid w:val="650D5E48"/>
     <w:multiLevelType w:val="multilevel"/>
     <w:tmpl w:val="544EAB0E"/>
@@ -1239,7 +3308,382 @@
       </w:rPr>
     </w:lvl>
   </w:abstractNum>
-  <w:abstractNum w:abstractNumId="5" w15:restartNumberingAfterBreak="0">
+  <w:abstractNum w:abstractNumId="17" w15:restartNumberingAfterBreak="0">
+    <w:nsid w:val="661B74E4"/>
+    <w:multiLevelType w:val="multilevel"/>
+    <w:tmpl w:val="61B84B4E"/>
+    <w:lvl w:ilvl="0">
+      <w:start w:val="1"/>
+      <w:numFmt w:val="bullet"/>
+      <w:lvlText w:val=""/>
+      <w:lvlJc w:val="left"/>
+      <w:pPr>
+        <w:tabs>
+          <w:tab w:val="num" w:pos="720"/>
+        </w:tabs>
+        <w:ind w:left="720" w:hanging="360"/>
+      </w:pPr>
+      <w:rPr>
+        <w:rFonts w:ascii="Symbol" w:hAnsi="Symbol" w:hint="default"/>
+        <w:sz w:val="20"/>
+      </w:rPr>
+    </w:lvl>
+    <w:lvl w:ilvl="1" w:tentative="1">
+      <w:start w:val="1"/>
+      <w:numFmt w:val="bullet"/>
+      <w:lvlText w:val="o"/>
+      <w:lvlJc w:val="left"/>
+      <w:pPr>
+        <w:tabs>
+          <w:tab w:val="num" w:pos="1440"/>
+        </w:tabs>
+        <w:ind w:left="1440" w:hanging="360"/>
+      </w:pPr>
+      <w:rPr>
+        <w:rFonts w:ascii="Courier New" w:hAnsi="Courier New" w:hint="default"/>
+        <w:sz w:val="20"/>
+      </w:rPr>
+    </w:lvl>
+    <w:lvl w:ilvl="2" w:tentative="1">
+      <w:start w:val="1"/>
+      <w:numFmt w:val="bullet"/>
+      <w:lvlText w:val=""/>
+      <w:lvlJc w:val="left"/>
+      <w:pPr>
+        <w:tabs>
+          <w:tab w:val="num" w:pos="2160"/>
+        </w:tabs>
+        <w:ind w:left="2160" w:hanging="360"/>
+      </w:pPr>
+      <w:rPr>
+        <w:rFonts w:ascii="Wingdings" w:hAnsi="Wingdings" w:hint="default"/>
+        <w:sz w:val="20"/>
+      </w:rPr>
+    </w:lvl>
+    <w:lvl w:ilvl="3" w:tentative="1">
+      <w:start w:val="1"/>
+      <w:numFmt w:val="bullet"/>
+      <w:lvlText w:val=""/>
+      <w:lvlJc w:val="left"/>
+      <w:pPr>
+        <w:tabs>
+          <w:tab w:val="num" w:pos="2880"/>
+        </w:tabs>
+        <w:ind w:left="2880" w:hanging="360"/>
+      </w:pPr>
+      <w:rPr>
+        <w:rFonts w:ascii="Wingdings" w:hAnsi="Wingdings" w:hint="default"/>
+        <w:sz w:val="20"/>
+      </w:rPr>
+    </w:lvl>
+    <w:lvl w:ilvl="4" w:tentative="1">
+      <w:start w:val="1"/>
+      <w:numFmt w:val="bullet"/>
+      <w:lvlText w:val=""/>
+      <w:lvlJc w:val="left"/>
+      <w:pPr>
+        <w:tabs>
+          <w:tab w:val="num" w:pos="3600"/>
+        </w:tabs>
+        <w:ind w:left="3600" w:hanging="360"/>
+      </w:pPr>
+      <w:rPr>
+        <w:rFonts w:ascii="Wingdings" w:hAnsi="Wingdings" w:hint="default"/>
+        <w:sz w:val="20"/>
+      </w:rPr>
+    </w:lvl>
+    <w:lvl w:ilvl="5" w:tentative="1">
+      <w:start w:val="1"/>
+      <w:numFmt w:val="bullet"/>
+      <w:lvlText w:val=""/>
+      <w:lvlJc w:val="left"/>
+      <w:pPr>
+        <w:tabs>
+          <w:tab w:val="num" w:pos="4320"/>
+        </w:tabs>
+        <w:ind w:left="4320" w:hanging="360"/>
+      </w:pPr>
+      <w:rPr>
+        <w:rFonts w:ascii="Wingdings" w:hAnsi="Wingdings" w:hint="default"/>
+        <w:sz w:val="20"/>
+      </w:rPr>
+    </w:lvl>
+    <w:lvl w:ilvl="6" w:tentative="1">
+      <w:start w:val="1"/>
+      <w:numFmt w:val="bullet"/>
+      <w:lvlText w:val=""/>
+      <w:lvlJc w:val="left"/>
+      <w:pPr>
+        <w:tabs>
+          <w:tab w:val="num" w:pos="5040"/>
+        </w:tabs>
+        <w:ind w:left="5040" w:hanging="360"/>
+      </w:pPr>
+      <w:rPr>
+        <w:rFonts w:ascii="Wingdings" w:hAnsi="Wingdings" w:hint="default"/>
+        <w:sz w:val="20"/>
+      </w:rPr>
+    </w:lvl>
+    <w:lvl w:ilvl="7" w:tentative="1">
+      <w:start w:val="1"/>
+      <w:numFmt w:val="bullet"/>
+      <w:lvlText w:val=""/>
+      <w:lvlJc w:val="left"/>
+      <w:pPr>
+        <w:tabs>
+          <w:tab w:val="num" w:pos="5760"/>
+        </w:tabs>
+        <w:ind w:left="5760" w:hanging="360"/>
+      </w:pPr>
+      <w:rPr>
+        <w:rFonts w:ascii="Wingdings" w:hAnsi="Wingdings" w:hint="default"/>
+        <w:sz w:val="20"/>
+      </w:rPr>
+    </w:lvl>
+    <w:lvl w:ilvl="8" w:tentative="1">
+      <w:start w:val="1"/>
+      <w:numFmt w:val="bullet"/>
+      <w:lvlText w:val=""/>
+      <w:lvlJc w:val="left"/>
+      <w:pPr>
+        <w:tabs>
+          <w:tab w:val="num" w:pos="6480"/>
+        </w:tabs>
+        <w:ind w:left="6480" w:hanging="360"/>
+      </w:pPr>
+      <w:rPr>
+        <w:rFonts w:ascii="Wingdings" w:hAnsi="Wingdings" w:hint="default"/>
+        <w:sz w:val="20"/>
+      </w:rPr>
+    </w:lvl>
+  </w:abstractNum>
+  <w:abstractNum w:abstractNumId="18" w15:restartNumberingAfterBreak="0">
+    <w:nsid w:val="66F2275D"/>
+    <w:multiLevelType w:val="hybridMultilevel"/>
+    <w:tmpl w:val="BAB2F792"/>
+    <w:lvl w:ilvl="0" w:tplc="0C090001">
+      <w:start w:val="1"/>
+      <w:numFmt w:val="bullet"/>
+      <w:lvlText w:val=""/>
+      <w:lvlJc w:val="left"/>
+      <w:pPr>
+        <w:ind w:left="720" w:hanging="360"/>
+      </w:pPr>
+      <w:rPr>
+        <w:rFonts w:ascii="Symbol" w:hAnsi="Symbol" w:hint="default"/>
+      </w:rPr>
+    </w:lvl>
+    <w:lvl w:ilvl="1" w:tplc="0C090003" w:tentative="1">
+      <w:start w:val="1"/>
+      <w:numFmt w:val="bullet"/>
+      <w:lvlText w:val="o"/>
+      <w:lvlJc w:val="left"/>
+      <w:pPr>
+        <w:ind w:left="1440" w:hanging="360"/>
+      </w:pPr>
+      <w:rPr>
+        <w:rFonts w:ascii="Courier New" w:hAnsi="Courier New" w:cs="Courier New" w:hint="default"/>
+      </w:rPr>
+    </w:lvl>
+    <w:lvl w:ilvl="2" w:tplc="0C090005" w:tentative="1">
+      <w:start w:val="1"/>
+      <w:numFmt w:val="bullet"/>
+      <w:lvlText w:val=""/>
+      <w:lvlJc w:val="left"/>
+      <w:pPr>
+        <w:ind w:left="2160" w:hanging="360"/>
+      </w:pPr>
+      <w:rPr>
+        <w:rFonts w:ascii="Wingdings" w:hAnsi="Wingdings" w:hint="default"/>
+      </w:rPr>
+    </w:lvl>
+    <w:lvl w:ilvl="3" w:tplc="0C090001" w:tentative="1">
+      <w:start w:val="1"/>
+      <w:numFmt w:val="bullet"/>
+      <w:lvlText w:val=""/>
+      <w:lvlJc w:val="left"/>
+      <w:pPr>
+        <w:ind w:left="2880" w:hanging="360"/>
+      </w:pPr>
+      <w:rPr>
+        <w:rFonts w:ascii="Symbol" w:hAnsi="Symbol" w:hint="default"/>
+      </w:rPr>
+    </w:lvl>
+    <w:lvl w:ilvl="4" w:tplc="0C090003" w:tentative="1">
+      <w:start w:val="1"/>
+      <w:numFmt w:val="bullet"/>
+      <w:lvlText w:val="o"/>
+      <w:lvlJc w:val="left"/>
+      <w:pPr>
+        <w:ind w:left="3600" w:hanging="360"/>
+      </w:pPr>
+      <w:rPr>
+        <w:rFonts w:ascii="Courier New" w:hAnsi="Courier New" w:cs="Courier New" w:hint="default"/>
+      </w:rPr>
+    </w:lvl>
+    <w:lvl w:ilvl="5" w:tplc="0C090005" w:tentative="1">
+      <w:start w:val="1"/>
+      <w:numFmt w:val="bullet"/>
+      <w:lvlText w:val=""/>
+      <w:lvlJc w:val="left"/>
+      <w:pPr>
+        <w:ind w:left="4320" w:hanging="360"/>
+      </w:pPr>
+      <w:rPr>
+        <w:rFonts w:ascii="Wingdings" w:hAnsi="Wingdings" w:hint="default"/>
+      </w:rPr>
+    </w:lvl>
+    <w:lvl w:ilvl="6" w:tplc="0C090001" w:tentative="1">
+      <w:start w:val="1"/>
+      <w:numFmt w:val="bullet"/>
+      <w:lvlText w:val=""/>
+      <w:lvlJc w:val="left"/>
+      <w:pPr>
+        <w:ind w:left="5040" w:hanging="360"/>
+      </w:pPr>
+      <w:rPr>
+        <w:rFonts w:ascii="Symbol" w:hAnsi="Symbol" w:hint="default"/>
+      </w:rPr>
+    </w:lvl>
+    <w:lvl w:ilvl="7" w:tplc="0C090003" w:tentative="1">
+      <w:start w:val="1"/>
+      <w:numFmt w:val="bullet"/>
+      <w:lvlText w:val="o"/>
+      <w:lvlJc w:val="left"/>
+      <w:pPr>
+        <w:ind w:left="5760" w:hanging="360"/>
+      </w:pPr>
+      <w:rPr>
+        <w:rFonts w:ascii="Courier New" w:hAnsi="Courier New" w:cs="Courier New" w:hint="default"/>
+      </w:rPr>
+    </w:lvl>
+    <w:lvl w:ilvl="8" w:tplc="0C090005" w:tentative="1">
+      <w:start w:val="1"/>
+      <w:numFmt w:val="bullet"/>
+      <w:lvlText w:val=""/>
+      <w:lvlJc w:val="left"/>
+      <w:pPr>
+        <w:ind w:left="6480" w:hanging="360"/>
+      </w:pPr>
+      <w:rPr>
+        <w:rFonts w:ascii="Wingdings" w:hAnsi="Wingdings" w:hint="default"/>
+      </w:rPr>
+    </w:lvl>
+  </w:abstractNum>
+  <w:abstractNum w:abstractNumId="19" w15:restartNumberingAfterBreak="0">
+    <w:nsid w:val="77ED0D0B"/>
+    <w:multiLevelType w:val="hybridMultilevel"/>
+    <w:tmpl w:val="FF4EFBFC"/>
+    <w:lvl w:ilvl="0" w:tplc="0C090001">
+      <w:start w:val="1"/>
+      <w:numFmt w:val="bullet"/>
+      <w:lvlText w:val=""/>
+      <w:lvlJc w:val="left"/>
+      <w:pPr>
+        <w:ind w:left="720" w:hanging="360"/>
+      </w:pPr>
+      <w:rPr>
+        <w:rFonts w:ascii="Symbol" w:hAnsi="Symbol" w:hint="default"/>
+      </w:rPr>
+    </w:lvl>
+    <w:lvl w:ilvl="1" w:tplc="0C090003" w:tentative="1">
+      <w:start w:val="1"/>
+      <w:numFmt w:val="bullet"/>
+      <w:lvlText w:val="o"/>
+      <w:lvlJc w:val="left"/>
+      <w:pPr>
+        <w:ind w:left="1440" w:hanging="360"/>
+      </w:pPr>
+      <w:rPr>
+        <w:rFonts w:ascii="Courier New" w:hAnsi="Courier New" w:cs="Courier New" w:hint="default"/>
+      </w:rPr>
+    </w:lvl>
+    <w:lvl w:ilvl="2" w:tplc="0C090005" w:tentative="1">
+      <w:start w:val="1"/>
+      <w:numFmt w:val="bullet"/>
+      <w:lvlText w:val=""/>
+      <w:lvlJc w:val="left"/>
+      <w:pPr>
+        <w:ind w:left="2160" w:hanging="360"/>
+      </w:pPr>
+      <w:rPr>
+        <w:rFonts w:ascii="Wingdings" w:hAnsi="Wingdings" w:hint="default"/>
+      </w:rPr>
+    </w:lvl>
+    <w:lvl w:ilvl="3" w:tplc="0C090001" w:tentative="1">
+      <w:start w:val="1"/>
+      <w:numFmt w:val="bullet"/>
+      <w:lvlText w:val=""/>
+      <w:lvlJc w:val="left"/>
+      <w:pPr>
+        <w:ind w:left="2880" w:hanging="360"/>
+      </w:pPr>
+      <w:rPr>
+        <w:rFonts w:ascii="Symbol" w:hAnsi="Symbol" w:hint="default"/>
+      </w:rPr>
+    </w:lvl>
+    <w:lvl w:ilvl="4" w:tplc="0C090003" w:tentative="1">
+      <w:start w:val="1"/>
+      <w:numFmt w:val="bullet"/>
+      <w:lvlText w:val="o"/>
+      <w:lvlJc w:val="left"/>
+      <w:pPr>
+        <w:ind w:left="3600" w:hanging="360"/>
+      </w:pPr>
+      <w:rPr>
+        <w:rFonts w:ascii="Courier New" w:hAnsi="Courier New" w:cs="Courier New" w:hint="default"/>
+      </w:rPr>
+    </w:lvl>
+    <w:lvl w:ilvl="5" w:tplc="0C090005" w:tentative="1">
+      <w:start w:val="1"/>
+      <w:numFmt w:val="bullet"/>
+      <w:lvlText w:val=""/>
+      <w:lvlJc w:val="left"/>
+      <w:pPr>
+        <w:ind w:left="4320" w:hanging="360"/>
+      </w:pPr>
+      <w:rPr>
+        <w:rFonts w:ascii="Wingdings" w:hAnsi="Wingdings" w:hint="default"/>
+      </w:rPr>
+    </w:lvl>
+    <w:lvl w:ilvl="6" w:tplc="0C090001" w:tentative="1">
+      <w:start w:val="1"/>
+      <w:numFmt w:val="bullet"/>
+      <w:lvlText w:val=""/>
+      <w:lvlJc w:val="left"/>
+      <w:pPr>
+        <w:ind w:left="5040" w:hanging="360"/>
+      </w:pPr>
+      <w:rPr>
+        <w:rFonts w:ascii="Symbol" w:hAnsi="Symbol" w:hint="default"/>
+      </w:rPr>
+    </w:lvl>
+    <w:lvl w:ilvl="7" w:tplc="0C090003" w:tentative="1">
+      <w:start w:val="1"/>
+      <w:numFmt w:val="bullet"/>
+      <w:lvlText w:val="o"/>
+      <w:lvlJc w:val="left"/>
+      <w:pPr>
+        <w:ind w:left="5760" w:hanging="360"/>
+      </w:pPr>
+      <w:rPr>
+        <w:rFonts w:ascii="Courier New" w:hAnsi="Courier New" w:cs="Courier New" w:hint="default"/>
+      </w:rPr>
+    </w:lvl>
+    <w:lvl w:ilvl="8" w:tplc="0C090005" w:tentative="1">
+      <w:start w:val="1"/>
+      <w:numFmt w:val="bullet"/>
+      <w:lvlText w:val=""/>
+      <w:lvlJc w:val="left"/>
+      <w:pPr>
+        <w:ind w:left="6480" w:hanging="360"/>
+      </w:pPr>
+      <w:rPr>
+        <w:rFonts w:ascii="Wingdings" w:hAnsi="Wingdings" w:hint="default"/>
+      </w:rPr>
+    </w:lvl>
+  </w:abstractNum>
+  <w:abstractNum w:abstractNumId="20" w15:restartNumberingAfterBreak="0">
     <w:nsid w:val="7AAA1B00"/>
     <w:multiLevelType w:val="multilevel"/>
     <w:tmpl w:val="1632F3B0"/>
@@ -1389,22 +3833,67 @@
     </w:lvl>
   </w:abstractNum>
   <w:num w:numId="1" w16cid:durableId="653216693">
+    <w:abstractNumId w:val="20"/>
+  </w:num>
+  <w:num w:numId="2" w16cid:durableId="596602819">
+    <w:abstractNumId w:val="3"/>
+  </w:num>
+  <w:num w:numId="3" w16cid:durableId="1535195422">
+    <w:abstractNumId w:val="16"/>
+  </w:num>
+  <w:num w:numId="4" w16cid:durableId="1244071980">
+    <w:abstractNumId w:val="1"/>
+  </w:num>
+  <w:num w:numId="5" w16cid:durableId="468668349">
+    <w:abstractNumId w:val="6"/>
+  </w:num>
+  <w:num w:numId="6" w16cid:durableId="76170877">
+    <w:abstractNumId w:val="11"/>
+  </w:num>
+  <w:num w:numId="7" w16cid:durableId="1067148401">
+    <w:abstractNumId w:val="15"/>
+  </w:num>
+  <w:num w:numId="8" w16cid:durableId="939220793">
+    <w:abstractNumId w:val="0"/>
+  </w:num>
+  <w:num w:numId="9" w16cid:durableId="711268635">
+    <w:abstractNumId w:val="17"/>
+  </w:num>
+  <w:num w:numId="10" w16cid:durableId="156465307">
+    <w:abstractNumId w:val="8"/>
+  </w:num>
+  <w:num w:numId="11" w16cid:durableId="1223251136">
+    <w:abstractNumId w:val="2"/>
+  </w:num>
+  <w:num w:numId="12" w16cid:durableId="269823173">
     <w:abstractNumId w:val="5"/>
   </w:num>
-  <w:num w:numId="2" w16cid:durableId="596602819">
-    <w:abstractNumId w:val="1"/>
+  <w:num w:numId="13" w16cid:durableId="205216211">
+    <w:abstractNumId w:val="9"/>
   </w:num>
-  <w:num w:numId="3" w16cid:durableId="1535195422">
+  <w:num w:numId="14" w16cid:durableId="844051687">
+    <w:abstractNumId w:val="10"/>
+  </w:num>
+  <w:num w:numId="15" w16cid:durableId="430709077">
+    <w:abstractNumId w:val="19"/>
+  </w:num>
+  <w:num w:numId="16" w16cid:durableId="1922258010">
+    <w:abstractNumId w:val="12"/>
+  </w:num>
+  <w:num w:numId="17" w16cid:durableId="32703722">
+    <w:abstractNumId w:val="7"/>
+  </w:num>
+  <w:num w:numId="18" w16cid:durableId="1153255750">
     <w:abstractNumId w:val="4"/>
   </w:num>
-  <w:num w:numId="4" w16cid:durableId="1244071980">
-    <w:abstractNumId w:val="0"/>
+  <w:num w:numId="19" w16cid:durableId="1369797157">
+    <w:abstractNumId w:val="13"/>
   </w:num>
-  <w:num w:numId="5" w16cid:durableId="468668349">
-    <w:abstractNumId w:val="2"/>
+  <w:num w:numId="20" w16cid:durableId="930511005">
+    <w:abstractNumId w:val="18"/>
   </w:num>
-  <w:num w:numId="6" w16cid:durableId="76170877">
-    <w:abstractNumId w:val="3"/>
+  <w:num w:numId="21" w16cid:durableId="1666130024">
+    <w:abstractNumId w:val="14"/>
   </w:num>
 </w:numbering>
 </file>
@@ -1837,7 +4326,6 @@
     <w:next w:val="Normal"/>
     <w:link w:val="Heading2Char"/>
     <w:uiPriority w:val="9"/>
-    <w:semiHidden/>
     <w:unhideWhenUsed/>
     <w:qFormat/>
     <w:rsid w:val="001665C5"/>
@@ -2053,7 +4541,6 @@
     <w:basedOn w:val="DefaultParagraphFont"/>
     <w:link w:val="Heading2"/>
     <w:uiPriority w:val="9"/>
-    <w:semiHidden/>
     <w:rsid w:val="001665C5"/>
     <w:rPr>
       <w:rFonts w:asciiTheme="majorHAnsi" w:eastAsiaTheme="majorEastAsia" w:hAnsiTheme="majorHAnsi" w:cstheme="majorBidi"/>
@@ -2323,6 +4810,62 @@
       <w:smallCaps/>
       <w:color w:val="0F4761" w:themeColor="accent1" w:themeShade="BF"/>
       <w:spacing w:val="5"/>
+    </w:rPr>
+  </w:style>
+  <w:style w:type="paragraph" w:styleId="TOCHeading">
+    <w:name w:val="TOC Heading"/>
+    <w:basedOn w:val="Heading1"/>
+    <w:next w:val="Normal"/>
+    <w:uiPriority w:val="39"/>
+    <w:unhideWhenUsed/>
+    <w:qFormat/>
+    <w:rsid w:val="00F65A0C"/>
+    <w:pPr>
+      <w:spacing w:before="240" w:after="0" w:line="259" w:lineRule="auto"/>
+      <w:outlineLvl w:val="9"/>
+    </w:pPr>
+    <w:rPr>
+      <w:kern w:val="0"/>
+      <w:sz w:val="32"/>
+      <w:szCs w:val="32"/>
+      <w:lang w:val="en-US"/>
+      <w14:ligatures w14:val="none"/>
+    </w:rPr>
+  </w:style>
+  <w:style w:type="paragraph" w:styleId="TOC1">
+    <w:name w:val="toc 1"/>
+    <w:basedOn w:val="Normal"/>
+    <w:next w:val="Normal"/>
+    <w:autoRedefine/>
+    <w:uiPriority w:val="39"/>
+    <w:unhideWhenUsed/>
+    <w:rsid w:val="00F65A0C"/>
+    <w:pPr>
+      <w:spacing w:after="100"/>
+    </w:pPr>
+  </w:style>
+  <w:style w:type="paragraph" w:styleId="TOC2">
+    <w:name w:val="toc 2"/>
+    <w:basedOn w:val="Normal"/>
+    <w:next w:val="Normal"/>
+    <w:autoRedefine/>
+    <w:uiPriority w:val="39"/>
+    <w:unhideWhenUsed/>
+    <w:rsid w:val="00F65A0C"/>
+    <w:pPr>
+      <w:spacing w:after="100"/>
+      <w:ind w:left="240"/>
+    </w:pPr>
+  </w:style>
+  <w:style w:type="character" w:styleId="Hyperlink">
+    <w:name w:val="Hyperlink"/>
+    <w:basedOn w:val="DefaultParagraphFont"/>
+    <w:uiPriority w:val="99"/>
+    <w:unhideWhenUsed/>
+    <w:rsid w:val="00F65A0C"/>
+    <w:rPr>
+      <w:color w:val="467886" w:themeColor="hyperlink"/>
+      <w:u w:val="single"/>
     </w:rPr>
   </w:style>
 </w:styles>

</xml_diff>